<commit_message>
Tag business rule types so BR-006's exclusion isn't flagged as a gap
business_rules.json rules now carry type: requirement-generating or
exclusion. uat-generator lists exclusion rules in coverage_report's
excluded_rules[] instead of issues[] -- coverage_report.json now
genuinely PASSes (100% traceability) instead of always FAILing on a
rule that was correctly out of scope by design.

verify_pipeline.py upgraded from warning to hard failure on an
uncovered business rule not typed "exclusion" -- the type field
removes the judgement call it used to punt on.

All three docx are also refreshed here, regenerated by their own
agent (brd-agent/frd-agent/uat-generator) rather than the shared
render_docx.py script.
</commit_message>
<xml_diff>
--- a/shared_outputs/BRD.docx
+++ b/shared_outputs/BRD.docx
@@ -11,22 +11,19 @@
       </w:r>
     </w:p>
     <w:p>
+      <w:pPr>
+        <w:pStyle w:val="Heading2"/>
+      </w:pPr>
       <w:r>
-        <w:rPr>
-          <w:b/>
-        </w:rPr>
         <w:t>Business Requirements Document — Online Banking Simulation v1</w:t>
       </w:r>
     </w:p>
     <w:p>
       <w:r>
-        <w:t xml:space="preserve">Version: 0.1.0-DRAFT | Status: </w:t>
-      </w:r>
-      <w:r>
         <w:rPr>
           <w:b/>
         </w:rPr>
-        <w:t>DRAFT — pending human approval</w:t>
+        <w:t>Status: DRAFT — pending human approval. Version: 1.0-draft.</w:t>
       </w:r>
     </w:p>
     <w:p>
@@ -47,7 +44,7 @@
     </w:p>
     <w:p>
       <w:r>
-        <w:t>This document defines the business requirements for v1 of the Online Banking Application student project: a synthetic banking simulation plus a traceable, agent-driven SDLC. It is produced by brd-agent from `charter.md` and `scope_agreement.md` only, and is a draft pending human review and approval.</w:t>
+        <w:t>This document captures the business requirements for v1 of the Online Banking Simulation: a synthetic online-banking application built as part of an end-to-end student SDLC project. It translates the approved project charter and scope agreement into scoped business rules and traceable functional and non-functional requirements, so that downstream design, build, test, and defect-analysis agents can work from a single, source-linked baseline.</w:t>
       </w:r>
     </w:p>
     <w:p>
@@ -60,7 +57,7 @@
     </w:p>
     <w:p>
       <w:r>
-        <w:t>Business Analysis (Ritu &amp; Team), Architecture/Development (Mohit &amp; Team), QA &amp; Testing (Mandeep &amp; Team), Defect Root-Cause Analysis (Adiba &amp; Team), and downstream agents in the Group 2 SDLC pipeline (technical design/coding, system-test/automation, defect root-cause analysis).</w:t>
+        <w:t>Business Analysis, Architecture/Development, Quality Assurance/Testing, and Defect Root-Cause-Analysis teams (and their supporting agents), plus the human reviewers who approve this document.</w:t>
       </w:r>
     </w:p>
     <w:p>
@@ -76,7 +73,7 @@
         <w:pStyle w:val="ListBullet"/>
       </w:pPr>
       <w:r>
-        <w:t>`charter.md` — project charter (problem statement, objectives).</w:t>
+        <w:t>charter.md — Project charter (problem statement and objectives)</w:t>
       </w:r>
     </w:p>
     <w:p>
@@ -84,7 +81,7 @@
         <w:pStyle w:val="ListBullet"/>
       </w:pPr>
       <w:r>
-        <w:t>`scope_agreement.md` v1.0 DRAFT — in-scope/out-of-scope items, roles, open questions.</w:t>
+        <w:t>scope_agreement.md — Scope Agreement — Online Banking Simulation v1 (v1.0, DRAFT)</w:t>
       </w:r>
     </w:p>
     <w:p>
@@ -92,7 +89,7 @@
         <w:pStyle w:val="ListBullet"/>
       </w:pPr>
       <w:r>
-        <w:t>`BRD_template.txt` — section structure used for this document.</w:t>
+        <w:t>BRD_template.txt — Business Requirements Document template</w:t>
       </w:r>
     </w:p>
     <w:p>
@@ -224,7 +221,7 @@
           </w:tcPr>
           <w:p>
             <w:r>
-              <w:t>Indian national identity number</w:t>
+              <w:t>Indian government-issued identity number</w:t>
             </w:r>
           </w:p>
         </w:tc>
@@ -280,7 +277,7 @@
           </w:tcPr>
           <w:p>
             <w:r>
-              <w:t>RCA</w:t>
+              <w:t>BR</w:t>
             </w:r>
           </w:p>
         </w:tc>
@@ -290,7 +287,7 @@
           </w:tcPr>
           <w:p>
             <w:r>
-              <w:t>Root-Cause Analysis</w:t>
+              <w:t>Business Rule</w:t>
             </w:r>
           </w:p>
         </w:tc>
@@ -302,7 +299,7 @@
           </w:tcPr>
           <w:p>
             <w:r>
-              <w:t>F*, NF*</w:t>
+              <w:t>F#/NF#</w:t>
             </w:r>
           </w:p>
         </w:tc>
@@ -312,7 +309,7 @@
           </w:tcPr>
           <w:p>
             <w:r>
-              <w:t>Functional / Non-Functional requirement IDs</w:t>
+              <w:t>Functional / Non-Functional requirement identifier</w:t>
             </w:r>
           </w:p>
         </w:tc>
@@ -324,7 +321,7 @@
           </w:tcPr>
           <w:p>
             <w:r>
-              <w:t>BR-xxx</w:t>
+              <w:t>OQ</w:t>
             </w:r>
           </w:p>
         </w:tc>
@@ -334,29 +331,7 @@
           </w:tcPr>
           <w:p>
             <w:r>
-              <w:t>Business Rule ID</w:t>
-            </w:r>
-          </w:p>
-        </w:tc>
-      </w:tr>
-      <w:tr>
-        <w:tc>
-          <w:tcPr>
-            <w:tcW w:type="dxa" w:w="4320"/>
-          </w:tcPr>
-          <w:p>
-            <w:r>
-              <w:t>OQ-xxx</w:t>
-            </w:r>
-          </w:p>
-        </w:tc>
-        <w:tc>
-          <w:tcPr>
-            <w:tcW w:type="dxa" w:w="4320"/>
-          </w:tcPr>
-          <w:p>
-            <w:r>
-              <w:t>Open Question ID</w:t>
+              <w:t>Open Question</w:t>
             </w:r>
           </w:p>
         </w:tc>
@@ -380,7 +355,7 @@
     </w:p>
     <w:p>
       <w:r>
-        <w:t>Customers expect secure digital access to onboarding, accounts, beneficiaries, transfers, statements, notifications, and service requests. Building even a simplified version requires coordinated business analysis, architecture, engineering, testing, evidence management, and defect triage. Student projects often treat these as isolated activities, causing ambiguous requirements, untestable designs, weak handoffs, and disagreement over whether failures are defects or new requests. This project asks four groups to build both a banking simulation and specialized agents that support a traceable SDLC, so that an approved business rule can be shown to become a requirement, design element, implementation, test, defect decision, and evidence record end to end.</w:t>
+        <w:t>Customers expect secure digital access to onboarding, accounts, beneficiaries, transfers, statements, notifications, and service requests. Building even a simplified version requires coordinated business analysis, architecture, engineering, testing, evidence management, and defect triage. Student projects often treat these as isolated activities, causing ambiguous requirements, untestable designs, weak handoffs, and disagreement over whether failures are defects or new requests. This project asks four groups to create both an online-banking simulation and specialized agents that support a traceable SDLC, so that an approved business rule can be shown to flow through to a requirement, design element, implementation, test, defect decision, and final evidence record.</w:t>
       </w:r>
     </w:p>
     <w:p>
@@ -404,7 +379,7 @@
         <w:pStyle w:val="ListNumber"/>
       </w:pPr>
       <w:r>
-        <w:t>Demonstrate customer and bank-operations' journeys with role-based access and auditable state changes.</w:t>
+        <w:t>Demonstrate customer and bank-operations journeys with role-based access and auditable state changes.</w:t>
       </w:r>
     </w:p>
     <w:p>
@@ -428,7 +403,7 @@
         <w:pStyle w:val="ListNumber"/>
       </w:pPr>
       <w:r>
-        <w:t>Use security, privacy, accessibility, reliability, and testability as acceptance conditions — not optional polish.</w:t>
+        <w:t>Use security, privacy, accessibility, reliability, and testability as acceptance conditions, not optional polish.</w:t>
       </w:r>
     </w:p>
     <w:p>
@@ -437,14 +412,6 @@
       </w:pPr>
       <w:r>
         <w:t>Practice governance: baselines, versioning, change control, traceability, evidence, risk management, and retrospectives.</w:t>
-      </w:r>
-    </w:p>
-    <w:p>
-      <w:pPr>
-        <w:pStyle w:val="ListNumber"/>
-      </w:pPr>
-      <w:r>
-        <w:t>Leverage AI agents to perform tasks and drive results, with human validation of agent-produced results.</w:t>
       </w:r>
     </w:p>
     <w:p>
@@ -500,7 +467,7 @@
           </w:tcPr>
           <w:p>
             <w:r>
-              <w:t>Business Analysis</w:t>
+              <w:t>Ritu &amp; Team</w:t>
             </w:r>
           </w:p>
         </w:tc>
@@ -510,7 +477,7 @@
           </w:tcPr>
           <w:p>
             <w:r>
-              <w:t>Ritu &amp; Team</w:t>
+              <w:t>Business Analysis</w:t>
             </w:r>
           </w:p>
         </w:tc>
@@ -522,7 +489,7 @@
           </w:tcPr>
           <w:p>
             <w:r>
-              <w:t>Architecture &amp; Build/Unit Test (Development)</w:t>
+              <w:t>Mohit &amp; Team</w:t>
             </w:r>
           </w:p>
         </w:tc>
@@ -532,7 +499,7 @@
           </w:tcPr>
           <w:p>
             <w:r>
-              <w:t>Mohit &amp; Team</w:t>
+              <w:t>Architecture &amp; Build and Unit Test (Development)</w:t>
             </w:r>
           </w:p>
         </w:tc>
@@ -544,7 +511,7 @@
           </w:tcPr>
           <w:p>
             <w:r>
-              <w:t>Quality Assurance &amp; Testing</w:t>
+              <w:t>Mandeep &amp; Team</w:t>
             </w:r>
           </w:p>
         </w:tc>
@@ -554,7 +521,7 @@
           </w:tcPr>
           <w:p>
             <w:r>
-              <w:t>Mandeep &amp; Team</w:t>
+              <w:t>Quality Assurance &amp; Testing</w:t>
             </w:r>
           </w:p>
         </w:tc>
@@ -566,7 +533,7 @@
           </w:tcPr>
           <w:p>
             <w:r>
-              <w:t>Defect Root-Cause Analysis</w:t>
+              <w:t>Adiba &amp; Team</w:t>
             </w:r>
           </w:p>
         </w:tc>
@@ -576,51 +543,7 @@
           </w:tcPr>
           <w:p>
             <w:r>
-              <w:t>Adiba &amp; Team</w:t>
-            </w:r>
-          </w:p>
-        </w:tc>
-      </w:tr>
-      <w:tr>
-        <w:tc>
-          <w:tcPr>
-            <w:tcW w:type="dxa" w:w="4320"/>
-          </w:tcPr>
-          <w:p>
-            <w:r>
-              <w:t>Customer</w:t>
-            </w:r>
-          </w:p>
-        </w:tc>
-        <w:tc>
-          <w:tcPr>
-            <w:tcW w:type="dxa" w:w="4320"/>
-          </w:tcPr>
-          <w:p>
-            <w:r>
-              <w:t>End user of the banking simulation</w:t>
-            </w:r>
-          </w:p>
-        </w:tc>
-      </w:tr>
-      <w:tr>
-        <w:tc>
-          <w:tcPr>
-            <w:tcW w:type="dxa" w:w="4320"/>
-          </w:tcPr>
-          <w:p>
-            <w:r>
-              <w:t>Bank operations</w:t>
-            </w:r>
-          </w:p>
-        </w:tc>
-        <w:tc>
-          <w:tcPr>
-            <w:tcW w:type="dxa" w:w="4320"/>
-          </w:tcPr>
-          <w:p>
-            <w:r>
-              <w:t>End user / internal staff role</w:t>
+              <w:t>Defect Root Cause Analysis</w:t>
             </w:r>
           </w:p>
         </w:tc>
@@ -639,58 +562,47 @@
         <w:rPr>
           <w:b/>
         </w:rPr>
-        <w:t>Constraints:</w:t>
-      </w:r>
-      <w:r>
-        <w:t xml:space="preserve"> all identities, accounts, and money movement are synthetic (BR-003); KYC checks are format-only, not real verification (BR-001).</w:t>
-      </w:r>
-    </w:p>
-    <w:p>
-      <w:r>
-        <w:rPr>
-          <w:b/>
-        </w:rPr>
         <w:t>Assumptions:</w:t>
       </w:r>
     </w:p>
     <w:p>
       <w:pPr>
-        <w:pStyle w:val="ListBullet"/>
+        <w:pStyle w:val="ListNumber"/>
       </w:pPr>
       <w:r>
-        <w:t>All identities, accounts, balances, and transactions are synthetic/test data; no real customer PII or real financial rails are involved.</w:t>
+        <w:t>All customer identities, accounts, balances, and transactions used in the simulation are synthetic, not real personal or financial data.</w:t>
       </w:r>
     </w:p>
     <w:p>
       <w:pPr>
-        <w:pStyle w:val="ListBullet"/>
+        <w:pStyle w:val="ListNumber"/>
       </w:pPr>
       <w:r>
-        <w:t>KYC document checks (Aadhaar, PAN) validate format only and do not call external government verification services.</w:t>
+        <w:t>KYC verification (Aadhaar, PAN) is a format-only check; there is no integration with real government verification systems.</w:t>
       </w:r>
     </w:p>
     <w:p>
       <w:pPr>
-        <w:pStyle w:val="ListBullet"/>
+        <w:pStyle w:val="ListNumber"/>
       </w:pPr>
       <w:r>
-        <w:t>Values for minimum balance and daily transfer cap are not yet defined (OQ-002, OQ-003) and are excluded from this BRD's requirements until resolved.</w:t>
+        <w:t>All money movement is synthetic; no real funds are ever transferred.</w:t>
       </w:r>
     </w:p>
     <w:p>
       <w:pPr>
-        <w:pStyle w:val="ListBullet"/>
+        <w:pStyle w:val="ListNumber"/>
       </w:pPr>
       <w:r>
-        <w:t>The UAT-executing party is not yet defined (OQ-001); acceptance testing is assumed to occur but the responsible party is pending confirmation.</w:t>
+        <w:t>The Business Analysis, Architecture/Development, QA/Testing, and Defect Root-Cause-Analysis personas are played by the named student teams for the duration of this project.</w:t>
       </w:r>
     </w:p>
     <w:p>
       <w:pPr>
-        <w:pStyle w:val="ListBullet"/>
+        <w:pStyle w:val="ListNumber"/>
       </w:pPr>
       <w:r>
-        <w:t>The data-testid selector convention for test automation is not yet confirmed (OQ-004) and is assumed to be settled before detailed system-test design begins.</w:t>
+        <w:t>Beneficiary management, notifications, and service requests are deferred beyond v1 and are not required for this BRD.</w:t>
       </w:r>
     </w:p>
     <w:p>
@@ -701,7 +613,7 @@
         <w:t>Dependencies:</w:t>
       </w:r>
       <w:r>
-        <w:t xml:space="preserve"> this BRD is the sole input (via approval) to the next SDLC stage (technical design/coding/unit-test agent); it depends only on `charter.md` and `scope_agreement.md` — there is no `approved/` predecessor for this stage.</w:t>
+        <w:t xml:space="preserve"> This BRD has no upstream `approved/` dependency; charter.md, scope_agreement.md, and BRD_template.txt are its only inputs.</w:t>
       </w:r>
     </w:p>
     <w:p>
@@ -714,7 +626,7 @@
     </w:p>
     <w:p>
       <w:r>
-        <w:t>Greenfield build. There is no pre-existing online-banking system for this student project; v1 is a new synthetic simulation built from the charter and scope agreement.</w:t>
+        <w:t>There is no pre-existing online banking system for this project. This is a greenfield build; there is no legacy state to migrate from.</w:t>
       </w:r>
     </w:p>
     <w:p>
@@ -733,315 +645,70 @@
         <w:t>5.1 In Scope</w:t>
       </w:r>
     </w:p>
-    <w:tbl>
-      <w:tblPr>
-        <w:tblStyle w:val="LightGrid-Accent1"/>
-        <w:tblW w:type="auto" w:w="0"/>
-        <w:tblLook w:firstColumn="1" w:firstRow="1" w:lastColumn="0" w:lastRow="0" w:noHBand="0" w:noVBand="1" w:val="04A0"/>
-      </w:tblPr>
-      <w:tblGrid>
-        <w:gridCol w:w="2880"/>
-        <w:gridCol w:w="2880"/>
-        <w:gridCol w:w="2880"/>
-      </w:tblGrid>
-      <w:tr>
-        <w:tc>
-          <w:tcPr>
-            <w:tcW w:type="dxa" w:w="2880"/>
-          </w:tcPr>
-          <w:p>
-            <w:r>
-              <w:rPr>
-                <w:b/>
-              </w:rPr>
-              <w:t>#</w:t>
-            </w:r>
-          </w:p>
-        </w:tc>
-        <w:tc>
-          <w:tcPr>
-            <w:tcW w:type="dxa" w:w="2880"/>
-          </w:tcPr>
-          <w:p>
-            <w:r>
-              <w:rPr>
-                <w:b/>
-              </w:rPr>
-              <w:t>Item</w:t>
-            </w:r>
-          </w:p>
-        </w:tc>
-        <w:tc>
-          <w:tcPr>
-            <w:tcW w:type="dxa" w:w="2880"/>
-          </w:tcPr>
-          <w:p>
-            <w:r>
-              <w:rPr>
-                <w:b/>
-              </w:rPr>
-              <w:t>Roles</w:t>
-            </w:r>
-          </w:p>
-        </w:tc>
-      </w:tr>
-      <w:tr>
-        <w:tc>
-          <w:tcPr>
-            <w:tcW w:type="dxa" w:w="2880"/>
-          </w:tcPr>
-          <w:p>
-            <w:r>
-              <w:t>1</w:t>
-            </w:r>
-          </w:p>
-        </w:tc>
-        <w:tc>
-          <w:tcPr>
-            <w:tcW w:type="dxa" w:w="2880"/>
-          </w:tcPr>
-          <w:p>
-            <w:r>
-              <w:t>Customer on-boarding with KYC (Aadhaar, PAN)</w:t>
-            </w:r>
-          </w:p>
-        </w:tc>
-        <w:tc>
-          <w:tcPr>
-            <w:tcW w:type="dxa" w:w="2880"/>
-          </w:tcPr>
-          <w:p>
-            <w:r>
-              <w:t>Customer, Bank operations</w:t>
-            </w:r>
-          </w:p>
-        </w:tc>
-      </w:tr>
-      <w:tr>
-        <w:tc>
-          <w:tcPr>
-            <w:tcW w:type="dxa" w:w="2880"/>
-          </w:tcPr>
-          <w:p>
-            <w:r>
-              <w:t>2</w:t>
-            </w:r>
-          </w:p>
-        </w:tc>
-        <w:tc>
-          <w:tcPr>
-            <w:tcW w:type="dxa" w:w="2880"/>
-          </w:tcPr>
-          <w:p>
-            <w:r>
-              <w:t>Account on-boarding and activation</w:t>
-            </w:r>
-          </w:p>
-        </w:tc>
-        <w:tc>
-          <w:tcPr>
-            <w:tcW w:type="dxa" w:w="2880"/>
-          </w:tcPr>
-          <w:p>
-            <w:r>
-              <w:t>Customer, Bank operations</w:t>
-            </w:r>
-          </w:p>
-        </w:tc>
-      </w:tr>
-      <w:tr>
-        <w:tc>
-          <w:tcPr>
-            <w:tcW w:type="dxa" w:w="2880"/>
-          </w:tcPr>
-          <w:p>
-            <w:r>
-              <w:t>3</w:t>
-            </w:r>
-          </w:p>
-        </w:tc>
-        <w:tc>
-          <w:tcPr>
-            <w:tcW w:type="dxa" w:w="2880"/>
-          </w:tcPr>
-          <w:p>
-            <w:r>
-              <w:t>Login</w:t>
-            </w:r>
-          </w:p>
-        </w:tc>
-        <w:tc>
-          <w:tcPr>
-            <w:tcW w:type="dxa" w:w="2880"/>
-          </w:tcPr>
-          <w:p>
-            <w:r>
-              <w:t>Customer, Bank operations</w:t>
-            </w:r>
-          </w:p>
-        </w:tc>
-      </w:tr>
-      <w:tr>
-        <w:tc>
-          <w:tcPr>
-            <w:tcW w:type="dxa" w:w="2880"/>
-          </w:tcPr>
-          <w:p>
-            <w:r>
-              <w:t>4</w:t>
-            </w:r>
-          </w:p>
-        </w:tc>
-        <w:tc>
-          <w:tcPr>
-            <w:tcW w:type="dxa" w:w="2880"/>
-          </w:tcPr>
-          <w:p>
-            <w:r>
-              <w:t>Logout</w:t>
-            </w:r>
-          </w:p>
-        </w:tc>
-        <w:tc>
-          <w:tcPr>
-            <w:tcW w:type="dxa" w:w="2880"/>
-          </w:tcPr>
-          <w:p>
-            <w:r>
-              <w:t>Customer, Bank operations</w:t>
-            </w:r>
-          </w:p>
-        </w:tc>
-      </w:tr>
-      <w:tr>
-        <w:tc>
-          <w:tcPr>
-            <w:tcW w:type="dxa" w:w="2880"/>
-          </w:tcPr>
-          <w:p>
-            <w:r>
-              <w:t>5</w:t>
-            </w:r>
-          </w:p>
-        </w:tc>
-        <w:tc>
-          <w:tcPr>
-            <w:tcW w:type="dxa" w:w="2880"/>
-          </w:tcPr>
-          <w:p>
-            <w:r>
-              <w:t>Money transfer</w:t>
-            </w:r>
-          </w:p>
-        </w:tc>
-        <w:tc>
-          <w:tcPr>
-            <w:tcW w:type="dxa" w:w="2880"/>
-          </w:tcPr>
-          <w:p>
-            <w:r>
-              <w:t>Customer</w:t>
-            </w:r>
-          </w:p>
-        </w:tc>
-      </w:tr>
-      <w:tr>
-        <w:tc>
-          <w:tcPr>
-            <w:tcW w:type="dxa" w:w="2880"/>
-          </w:tcPr>
-          <w:p>
-            <w:r>
-              <w:t>6</w:t>
-            </w:r>
-          </w:p>
-        </w:tc>
-        <w:tc>
-          <w:tcPr>
-            <w:tcW w:type="dxa" w:w="2880"/>
-          </w:tcPr>
-          <w:p>
-            <w:r>
-              <w:t>Money receive</w:t>
-            </w:r>
-          </w:p>
-        </w:tc>
-        <w:tc>
-          <w:tcPr>
-            <w:tcW w:type="dxa" w:w="2880"/>
-          </w:tcPr>
-          <w:p>
-            <w:r>
-              <w:t>Customer</w:t>
-            </w:r>
-          </w:p>
-        </w:tc>
-      </w:tr>
-      <w:tr>
-        <w:tc>
-          <w:tcPr>
-            <w:tcW w:type="dxa" w:w="2880"/>
-          </w:tcPr>
-          <w:p>
-            <w:r>
-              <w:t>7</w:t>
-            </w:r>
-          </w:p>
-        </w:tc>
-        <w:tc>
-          <w:tcPr>
-            <w:tcW w:type="dxa" w:w="2880"/>
-          </w:tcPr>
-          <w:p>
-            <w:r>
-              <w:t>Statement view</w:t>
-            </w:r>
-          </w:p>
-        </w:tc>
-        <w:tc>
-          <w:tcPr>
-            <w:tcW w:type="dxa" w:w="2880"/>
-          </w:tcPr>
-          <w:p>
-            <w:r>
-              <w:t>Customer, Bank operations</w:t>
-            </w:r>
-          </w:p>
-        </w:tc>
-      </w:tr>
-      <w:tr>
-        <w:tc>
-          <w:tcPr>
-            <w:tcW w:type="dxa" w:w="2880"/>
-          </w:tcPr>
-          <w:p>
-            <w:r>
-              <w:t>8</w:t>
-            </w:r>
-          </w:p>
-        </w:tc>
-        <w:tc>
-          <w:tcPr>
-            <w:tcW w:type="dxa" w:w="2880"/>
-          </w:tcPr>
-          <w:p>
-            <w:r>
-              <w:t>Statement download</w:t>
-            </w:r>
-          </w:p>
-        </w:tc>
-        <w:tc>
-          <w:tcPr>
-            <w:tcW w:type="dxa" w:w="2880"/>
-          </w:tcPr>
-          <w:p>
-            <w:r>
-              <w:t>Customer</w:t>
-            </w:r>
-          </w:p>
-        </w:tc>
-      </w:tr>
-    </w:tbl>
+    <w:p>
+      <w:pPr>
+        <w:pStyle w:val="ListNumber"/>
+      </w:pPr>
+      <w:r>
+        <w:t>Customer on-boarding with KYC (Aadhaar, PAN) — Customer, Bank operations</w:t>
+      </w:r>
+    </w:p>
+    <w:p>
+      <w:pPr>
+        <w:pStyle w:val="ListNumber"/>
+      </w:pPr>
+      <w:r>
+        <w:t>Account on-boarding and activation — Customer, Bank operations</w:t>
+      </w:r>
+    </w:p>
+    <w:p>
+      <w:pPr>
+        <w:pStyle w:val="ListNumber"/>
+      </w:pPr>
+      <w:r>
+        <w:t>Login — Customer, Bank operations</w:t>
+      </w:r>
+    </w:p>
+    <w:p>
+      <w:pPr>
+        <w:pStyle w:val="ListNumber"/>
+      </w:pPr>
+      <w:r>
+        <w:t>Logout — Customer, Bank operations</w:t>
+      </w:r>
+    </w:p>
+    <w:p>
+      <w:pPr>
+        <w:pStyle w:val="ListNumber"/>
+      </w:pPr>
+      <w:r>
+        <w:t>Money transfer — Customer</w:t>
+      </w:r>
+    </w:p>
+    <w:p>
+      <w:pPr>
+        <w:pStyle w:val="ListNumber"/>
+      </w:pPr>
+      <w:r>
+        <w:t>Money receive — Customer</w:t>
+      </w:r>
+    </w:p>
+    <w:p>
+      <w:pPr>
+        <w:pStyle w:val="ListNumber"/>
+      </w:pPr>
+      <w:r>
+        <w:t>Statement view — Customer, Bank operations</w:t>
+      </w:r>
+    </w:p>
+    <w:p>
+      <w:pPr>
+        <w:pStyle w:val="ListNumber"/>
+      </w:pPr>
+      <w:r>
+        <w:t>Statement download — Customer</w:t>
+      </w:r>
+    </w:p>
     <w:p>
       <w:pPr>
         <w:pStyle w:val="Heading3"/>
@@ -1105,7 +772,7 @@
           </w:tcPr>
           <w:p>
             <w:r>
-              <w:t>Not on build list for v1</w:t>
+              <w:t>Not on build list</w:t>
             </w:r>
           </w:p>
         </w:tc>
@@ -1127,7 +794,7 @@
           </w:tcPr>
           <w:p>
             <w:r>
-              <w:t>Format check only; verification is mocked</w:t>
+              <w:t>Format check only, mocked</w:t>
             </w:r>
           </w:p>
         </w:tc>
@@ -1218,7 +885,7 @@
           </w:tcPr>
           <w:p>
             <w:r>
-              <w:t>Registers, completes KYC, logs in, transfers funds, and views/downloads statements.</w:t>
+              <w:t>Registers, completes KYC, logs in, transfers money, views/downloads statements</w:t>
             </w:r>
           </w:p>
         </w:tc>
@@ -1240,7 +907,7 @@
           </w:tcPr>
           <w:p>
             <w:r>
-              <w:t>Reviews KYC, activates/freezes accounts, views the audit trail; cannot transfer funds.</w:t>
+              <w:t>Reviews KYC, activates/freezes accounts, views audit trail; cannot transfer money</w:t>
             </w:r>
           </w:p>
         </w:tc>
@@ -1261,16 +928,17 @@
         <w:tblLook w:firstColumn="1" w:firstRow="1" w:lastColumn="0" w:lastRow="0" w:noHBand="0" w:noVBand="1" w:val="04A0"/>
       </w:tblPr>
       <w:tblGrid>
-        <w:gridCol w:w="1728"/>
-        <w:gridCol w:w="1728"/>
-        <w:gridCol w:w="1728"/>
-        <w:gridCol w:w="1728"/>
-        <w:gridCol w:w="1728"/>
+        <w:gridCol w:w="1440"/>
+        <w:gridCol w:w="1440"/>
+        <w:gridCol w:w="1440"/>
+        <w:gridCol w:w="1440"/>
+        <w:gridCol w:w="1440"/>
+        <w:gridCol w:w="1440"/>
       </w:tblGrid>
       <w:tr>
         <w:tc>
           <w:tcPr>
-            <w:tcW w:type="dxa" w:w="1728"/>
+            <w:tcW w:type="dxa" w:w="1440"/>
           </w:tcPr>
           <w:p>
             <w:r>
@@ -1283,7 +951,7 @@
         </w:tc>
         <w:tc>
           <w:tcPr>
-            <w:tcW w:type="dxa" w:w="1728"/>
+            <w:tcW w:type="dxa" w:w="1440"/>
           </w:tcPr>
           <w:p>
             <w:r>
@@ -1296,7 +964,33 @@
         </w:tc>
         <w:tc>
           <w:tcPr>
-            <w:tcW w:type="dxa" w:w="1728"/>
+            <w:tcW w:type="dxa" w:w="1440"/>
+          </w:tcPr>
+          <w:p>
+            <w:r>
+              <w:rPr>
+                <w:b/>
+              </w:rPr>
+              <w:t>Rationale</w:t>
+            </w:r>
+          </w:p>
+        </w:tc>
+        <w:tc>
+          <w:tcPr>
+            <w:tcW w:type="dxa" w:w="1440"/>
+          </w:tcPr>
+          <w:p>
+            <w:r>
+              <w:rPr>
+                <w:b/>
+              </w:rPr>
+              <w:t>Roles</w:t>
+            </w:r>
+          </w:p>
+        </w:tc>
+        <w:tc>
+          <w:tcPr>
+            <w:tcW w:type="dxa" w:w="1440"/>
           </w:tcPr>
           <w:p>
             <w:r>
@@ -1309,27 +1003,14 @@
         </w:tc>
         <w:tc>
           <w:tcPr>
-            <w:tcW w:type="dxa" w:w="1728"/>
+            <w:tcW w:type="dxa" w:w="1440"/>
           </w:tcPr>
           <w:p>
             <w:r>
               <w:rPr>
                 <w:b/>
               </w:rPr>
-              <w:t>Roles</w:t>
-            </w:r>
-          </w:p>
-        </w:tc>
-        <w:tc>
-          <w:tcPr>
-            <w:tcW w:type="dxa" w:w="1728"/>
-          </w:tcPr>
-          <w:p>
-            <w:r>
-              <w:rPr>
-                <w:b/>
-              </w:rPr>
-              <w:t>Source</w:t>
+              <w:t>Status</w:t>
             </w:r>
           </w:p>
         </w:tc>
@@ -1337,7 +1018,7 @@
       <w:tr>
         <w:tc>
           <w:tcPr>
-            <w:tcW w:type="dxa" w:w="1728"/>
+            <w:tcW w:type="dxa" w:w="1440"/>
           </w:tcPr>
           <w:p>
             <w:r>
@@ -1347,17 +1028,37 @@
         </w:tc>
         <w:tc>
           <w:tcPr>
-            <w:tcW w:type="dxa" w:w="1728"/>
+            <w:tcW w:type="dxa" w:w="1440"/>
           </w:tcPr>
           <w:p>
             <w:r>
-              <w:t>Customer onboarding requires KYC using Aadhaar and PAN identity documents, validated by format only; no real government verification is performed.</w:t>
+              <w:t>KYC verification (Aadhaar, PAN) is a format-only check; no real government verification is performed. All KYC data is mocked/synthetic.</w:t>
             </w:r>
           </w:p>
         </w:tc>
         <w:tc>
           <w:tcPr>
-            <w:tcW w:type="dxa" w:w="1728"/>
+            <w:tcW w:type="dxa" w:w="1440"/>
+          </w:tcPr>
+          <w:p>
+            <w:r>
+              <w:t>Real Aadhaar/PAN verification is out of scope for v1; only a format check is required.</w:t>
+            </w:r>
+          </w:p>
+        </w:tc>
+        <w:tc>
+          <w:tcPr>
+            <w:tcW w:type="dxa" w:w="1440"/>
+          </w:tcPr>
+          <w:p>
+            <w:r>
+              <w:t>Customer, Bank operations</w:t>
+            </w:r>
+          </w:p>
+        </w:tc>
+        <w:tc>
+          <w:tcPr>
+            <w:tcW w:type="dxa" w:w="1440"/>
           </w:tcPr>
           <w:p>
             <w:r>
@@ -1367,7 +1068,235 @@
         </w:tc>
         <w:tc>
           <w:tcPr>
-            <w:tcW w:type="dxa" w:w="1728"/>
+            <w:tcW w:type="dxa" w:w="1440"/>
+          </w:tcPr>
+          <w:p>
+            <w:r>
+              <w:t>Draft</w:t>
+            </w:r>
+          </w:p>
+        </w:tc>
+      </w:tr>
+      <w:tr>
+        <w:tc>
+          <w:tcPr>
+            <w:tcW w:type="dxa" w:w="1440"/>
+          </w:tcPr>
+          <w:p>
+            <w:r>
+              <w:t>BR-002</w:t>
+            </w:r>
+          </w:p>
+        </w:tc>
+        <w:tc>
+          <w:tcPr>
+            <w:tcW w:type="dxa" w:w="1440"/>
+          </w:tcPr>
+          <w:p>
+            <w:r>
+              <w:t>A Customer account must be reviewed and activated by a Bank operations user before it can be used.</w:t>
+            </w:r>
+          </w:p>
+        </w:tc>
+        <w:tc>
+          <w:tcPr>
+            <w:tcW w:type="dxa" w:w="1440"/>
+          </w:tcPr>
+          <w:p>
+            <w:r>
+              <w:t>Account on-boarding and activation is in scope, and Bank operations' responsibility includes reviewing KYC and activating accounts.</w:t>
+            </w:r>
+          </w:p>
+        </w:tc>
+        <w:tc>
+          <w:tcPr>
+            <w:tcW w:type="dxa" w:w="1440"/>
+          </w:tcPr>
+          <w:p>
+            <w:r>
+              <w:t>Bank operations</w:t>
+            </w:r>
+          </w:p>
+        </w:tc>
+        <w:tc>
+          <w:tcPr>
+            <w:tcW w:type="dxa" w:w="1440"/>
+          </w:tcPr>
+          <w:p>
+            <w:r>
+              <w:t>Must</w:t>
+            </w:r>
+          </w:p>
+        </w:tc>
+        <w:tc>
+          <w:tcPr>
+            <w:tcW w:type="dxa" w:w="1440"/>
+          </w:tcPr>
+          <w:p>
+            <w:r>
+              <w:t>Draft</w:t>
+            </w:r>
+          </w:p>
+        </w:tc>
+      </w:tr>
+      <w:tr>
+        <w:tc>
+          <w:tcPr>
+            <w:tcW w:type="dxa" w:w="1440"/>
+          </w:tcPr>
+          <w:p>
+            <w:r>
+              <w:t>BR-003</w:t>
+            </w:r>
+          </w:p>
+        </w:tc>
+        <w:tc>
+          <w:tcPr>
+            <w:tcW w:type="dxa" w:w="1440"/>
+          </w:tcPr>
+          <w:p>
+            <w:r>
+              <w:t>Bank operations may review KYC, activate or freeze accounts, and view the audit trail, but must not initiate money transfers.</w:t>
+            </w:r>
+          </w:p>
+        </w:tc>
+        <w:tc>
+          <w:tcPr>
+            <w:tcW w:type="dxa" w:w="1440"/>
+          </w:tcPr>
+          <w:p>
+            <w:r>
+              <w:t>The Roles section explicitly restricts Bank operations from transferring money.</w:t>
+            </w:r>
+          </w:p>
+        </w:tc>
+        <w:tc>
+          <w:tcPr>
+            <w:tcW w:type="dxa" w:w="1440"/>
+          </w:tcPr>
+          <w:p>
+            <w:r>
+              <w:t>Bank operations</w:t>
+            </w:r>
+          </w:p>
+        </w:tc>
+        <w:tc>
+          <w:tcPr>
+            <w:tcW w:type="dxa" w:w="1440"/>
+          </w:tcPr>
+          <w:p>
+            <w:r>
+              <w:t>Must</w:t>
+            </w:r>
+          </w:p>
+        </w:tc>
+        <w:tc>
+          <w:tcPr>
+            <w:tcW w:type="dxa" w:w="1440"/>
+          </w:tcPr>
+          <w:p>
+            <w:r>
+              <w:t>Draft</w:t>
+            </w:r>
+          </w:p>
+        </w:tc>
+      </w:tr>
+      <w:tr>
+        <w:tc>
+          <w:tcPr>
+            <w:tcW w:type="dxa" w:w="1440"/>
+          </w:tcPr>
+          <w:p>
+            <w:r>
+              <w:t>BR-004</w:t>
+            </w:r>
+          </w:p>
+        </w:tc>
+        <w:tc>
+          <w:tcPr>
+            <w:tcW w:type="dxa" w:w="1440"/>
+          </w:tcPr>
+          <w:p>
+            <w:r>
+              <w:t>Only an authenticated Customer may initiate a money transfer or view/download their own statements.</w:t>
+            </w:r>
+          </w:p>
+        </w:tc>
+        <w:tc>
+          <w:tcPr>
+            <w:tcW w:type="dxa" w:w="1440"/>
+          </w:tcPr>
+          <w:p>
+            <w:r>
+              <w:t>Money transfer, statement view, and statement download are scoped to the Customer role.</w:t>
+            </w:r>
+          </w:p>
+        </w:tc>
+        <w:tc>
+          <w:tcPr>
+            <w:tcW w:type="dxa" w:w="1440"/>
+          </w:tcPr>
+          <w:p>
+            <w:r>
+              <w:t>Customer</w:t>
+            </w:r>
+          </w:p>
+        </w:tc>
+        <w:tc>
+          <w:tcPr>
+            <w:tcW w:type="dxa" w:w="1440"/>
+          </w:tcPr>
+          <w:p>
+            <w:r>
+              <w:t>Must</w:t>
+            </w:r>
+          </w:p>
+        </w:tc>
+        <w:tc>
+          <w:tcPr>
+            <w:tcW w:type="dxa" w:w="1440"/>
+          </w:tcPr>
+          <w:p>
+            <w:r>
+              <w:t>Draft</w:t>
+            </w:r>
+          </w:p>
+        </w:tc>
+      </w:tr>
+      <w:tr>
+        <w:tc>
+          <w:tcPr>
+            <w:tcW w:type="dxa" w:w="1440"/>
+          </w:tcPr>
+          <w:p>
+            <w:r>
+              <w:t>BR-005</w:t>
+            </w:r>
+          </w:p>
+        </w:tc>
+        <w:tc>
+          <w:tcPr>
+            <w:tcW w:type="dxa" w:w="1440"/>
+          </w:tcPr>
+          <w:p>
+            <w:r>
+              <w:t>All money movement in the simulation is synthetic; no real funds are transferred at any point.</w:t>
+            </w:r>
+          </w:p>
+        </w:tc>
+        <w:tc>
+          <w:tcPr>
+            <w:tcW w:type="dxa" w:w="1440"/>
+          </w:tcPr>
+          <w:p>
+            <w:r>
+              <w:t>Real money movement is explicitly out of scope.</w:t>
+            </w:r>
+          </w:p>
+        </w:tc>
+        <w:tc>
+          <w:tcPr>
+            <w:tcW w:type="dxa" w:w="1440"/>
           </w:tcPr>
           <w:p>
             <w:r>
@@ -1377,39 +1306,7 @@
         </w:tc>
         <w:tc>
           <w:tcPr>
-            <w:tcW w:type="dxa" w:w="1728"/>
-          </w:tcPr>
-          <w:p>
-            <w:r>
-              <w:t>SA-1, SA-OOS-2</w:t>
-            </w:r>
-          </w:p>
-        </w:tc>
-      </w:tr>
-      <w:tr>
-        <w:tc>
-          <w:tcPr>
-            <w:tcW w:type="dxa" w:w="1728"/>
-          </w:tcPr>
-          <w:p>
-            <w:r>
-              <w:t>BR-002</w:t>
-            </w:r>
-          </w:p>
-        </w:tc>
-        <w:tc>
-          <w:tcPr>
-            <w:tcW w:type="dxa" w:w="1728"/>
-          </w:tcPr>
-          <w:p>
-            <w:r>
-              <w:t>An account must be reviewed and activated by Bank operations before it can be used for transactions.</w:t>
-            </w:r>
-          </w:p>
-        </w:tc>
-        <w:tc>
-          <w:tcPr>
-            <w:tcW w:type="dxa" w:w="1728"/>
+            <w:tcW w:type="dxa" w:w="1440"/>
           </w:tcPr>
           <w:p>
             <w:r>
@@ -1419,7 +1316,49 @@
         </w:tc>
         <w:tc>
           <w:tcPr>
-            <w:tcW w:type="dxa" w:w="1728"/>
+            <w:tcW w:type="dxa" w:w="1440"/>
+          </w:tcPr>
+          <w:p>
+            <w:r>
+              <w:t>Draft</w:t>
+            </w:r>
+          </w:p>
+        </w:tc>
+      </w:tr>
+      <w:tr>
+        <w:tc>
+          <w:tcPr>
+            <w:tcW w:type="dxa" w:w="1440"/>
+          </w:tcPr>
+          <w:p>
+            <w:r>
+              <w:t>BR-006</w:t>
+            </w:r>
+          </w:p>
+        </w:tc>
+        <w:tc>
+          <w:tcPr>
+            <w:tcW w:type="dxa" w:w="1440"/>
+          </w:tcPr>
+          <w:p>
+            <w:r>
+              <w:t>Beneficiary management, notifications, and service requests are excluded from the v1 build.</w:t>
+            </w:r>
+          </w:p>
+        </w:tc>
+        <w:tc>
+          <w:tcPr>
+            <w:tcW w:type="dxa" w:w="1440"/>
+          </w:tcPr>
+          <w:p>
+            <w:r>
+              <w:t>Explicitly listed as out of scope and not on the build list for v1.</w:t>
+            </w:r>
+          </w:p>
+        </w:tc>
+        <w:tc>
+          <w:tcPr>
+            <w:tcW w:type="dxa" w:w="1440"/>
           </w:tcPr>
           <w:p>
             <w:r>
@@ -1429,39 +1368,7 @@
         </w:tc>
         <w:tc>
           <w:tcPr>
-            <w:tcW w:type="dxa" w:w="1728"/>
-          </w:tcPr>
-          <w:p>
-            <w:r>
-              <w:t>SA-2, SA-ROLE-OPS</w:t>
-            </w:r>
-          </w:p>
-        </w:tc>
-      </w:tr>
-      <w:tr>
-        <w:tc>
-          <w:tcPr>
-            <w:tcW w:type="dxa" w:w="1728"/>
-          </w:tcPr>
-          <w:p>
-            <w:r>
-              <w:t>BR-003</w:t>
-            </w:r>
-          </w:p>
-        </w:tc>
-        <w:tc>
-          <w:tcPr>
-            <w:tcW w:type="dxa" w:w="1728"/>
-          </w:tcPr>
-          <w:p>
-            <w:r>
-              <w:t>All money transfers and receipts are synthetic; no integration with real payment rails or real fund movement is performed.</w:t>
-            </w:r>
-          </w:p>
-        </w:tc>
-        <w:tc>
-          <w:tcPr>
-            <w:tcW w:type="dxa" w:w="1728"/>
+            <w:tcW w:type="dxa" w:w="1440"/>
           </w:tcPr>
           <w:p>
             <w:r>
@@ -1471,21 +1378,11 @@
         </w:tc>
         <w:tc>
           <w:tcPr>
-            <w:tcW w:type="dxa" w:w="1728"/>
+            <w:tcW w:type="dxa" w:w="1440"/>
           </w:tcPr>
           <w:p>
             <w:r>
-              <w:t>Customer</w:t>
-            </w:r>
-          </w:p>
-        </w:tc>
-        <w:tc>
-          <w:tcPr>
-            <w:tcW w:type="dxa" w:w="1728"/>
-          </w:tcPr>
-          <w:p>
-            <w:r>
-              <w:t>SA-OOS-3</w:t>
+              <w:t>Draft</w:t>
             </w:r>
           </w:p>
         </w:tc>
@@ -1493,27 +1390,109 @@
       <w:tr>
         <w:tc>
           <w:tcPr>
-            <w:tcW w:type="dxa" w:w="1728"/>
+            <w:tcW w:type="dxa" w:w="1440"/>
           </w:tcPr>
           <w:p>
             <w:r>
-              <w:t>BR-004</w:t>
+              <w:t>BR-007</w:t>
             </w:r>
           </w:p>
         </w:tc>
         <w:tc>
           <w:tcPr>
-            <w:tcW w:type="dxa" w:w="1728"/>
+            <w:tcW w:type="dxa" w:w="1440"/>
           </w:tcPr>
           <w:p>
             <w:r>
-              <w:t>The Customer role may register, complete KYC, log in, transfer funds, and view/download statements.</w:t>
+              <w:t>Every account and transaction state change (e.g. activation, freeze, transfer, login/logout) must be recorded and viewable by Bank operations as an audit trail.</w:t>
             </w:r>
           </w:p>
         </w:tc>
         <w:tc>
           <w:tcPr>
-            <w:tcW w:type="dxa" w:w="1728"/>
+            <w:tcW w:type="dxa" w:w="1440"/>
+          </w:tcPr>
+          <w:p>
+            <w:r>
+              <w:t>The charter requires auditable state changes; Bank operations' role includes viewing the audit trail.</w:t>
+            </w:r>
+          </w:p>
+        </w:tc>
+        <w:tc>
+          <w:tcPr>
+            <w:tcW w:type="dxa" w:w="1440"/>
+          </w:tcPr>
+          <w:p>
+            <w:r>
+              <w:t>Bank operations</w:t>
+            </w:r>
+          </w:p>
+        </w:tc>
+        <w:tc>
+          <w:tcPr>
+            <w:tcW w:type="dxa" w:w="1440"/>
+          </w:tcPr>
+          <w:p>
+            <w:r>
+              <w:t>Should</w:t>
+            </w:r>
+          </w:p>
+        </w:tc>
+        <w:tc>
+          <w:tcPr>
+            <w:tcW w:type="dxa" w:w="1440"/>
+          </w:tcPr>
+          <w:p>
+            <w:r>
+              <w:t>Draft</w:t>
+            </w:r>
+          </w:p>
+        </w:tc>
+      </w:tr>
+      <w:tr>
+        <w:tc>
+          <w:tcPr>
+            <w:tcW w:type="dxa" w:w="1440"/>
+          </w:tcPr>
+          <w:p>
+            <w:r>
+              <w:t>BR-008</w:t>
+            </w:r>
+          </w:p>
+        </w:tc>
+        <w:tc>
+          <w:tcPr>
+            <w:tcW w:type="dxa" w:w="1440"/>
+          </w:tcPr>
+          <w:p>
+            <w:r>
+              <w:t>A user session must require successful login authentication and must be terminated on logout.</w:t>
+            </w:r>
+          </w:p>
+        </w:tc>
+        <w:tc>
+          <w:tcPr>
+            <w:tcW w:type="dxa" w:w="1440"/>
+          </w:tcPr>
+          <w:p>
+            <w:r>
+              <w:t>Login and logout are in scope and are access-control preconditions for all other in-scope activities.</w:t>
+            </w:r>
+          </w:p>
+        </w:tc>
+        <w:tc>
+          <w:tcPr>
+            <w:tcW w:type="dxa" w:w="1440"/>
+          </w:tcPr>
+          <w:p>
+            <w:r>
+              <w:t>Customer, Bank operations</w:t>
+            </w:r>
+          </w:p>
+        </w:tc>
+        <w:tc>
+          <w:tcPr>
+            <w:tcW w:type="dxa" w:w="1440"/>
           </w:tcPr>
           <w:p>
             <w:r>
@@ -1523,404 +1502,16 @@
         </w:tc>
         <w:tc>
           <w:tcPr>
-            <w:tcW w:type="dxa" w:w="1728"/>
+            <w:tcW w:type="dxa" w:w="1440"/>
           </w:tcPr>
           <w:p>
             <w:r>
-              <w:t>Customer</w:t>
-            </w:r>
-          </w:p>
-        </w:tc>
-        <w:tc>
-          <w:tcPr>
-            <w:tcW w:type="dxa" w:w="1728"/>
-          </w:tcPr>
-          <w:p>
-            <w:r>
-              <w:t>SA-ROLE-CUST</w:t>
-            </w:r>
-          </w:p>
-        </w:tc>
-      </w:tr>
-      <w:tr>
-        <w:tc>
-          <w:tcPr>
-            <w:tcW w:type="dxa" w:w="1728"/>
-          </w:tcPr>
-          <w:p>
-            <w:r>
-              <w:t>BR-005</w:t>
-            </w:r>
-          </w:p>
-        </w:tc>
-        <w:tc>
-          <w:tcPr>
-            <w:tcW w:type="dxa" w:w="1728"/>
-          </w:tcPr>
-          <w:p>
-            <w:r>
-              <w:t>The Bank operations role may review KYC, activate or freeze accounts, and view the audit trail, but may not initiate money transfers.</w:t>
-            </w:r>
-          </w:p>
-        </w:tc>
-        <w:tc>
-          <w:tcPr>
-            <w:tcW w:type="dxa" w:w="1728"/>
-          </w:tcPr>
-          <w:p>
-            <w:r>
-              <w:t>Must</w:t>
-            </w:r>
-          </w:p>
-        </w:tc>
-        <w:tc>
-          <w:tcPr>
-            <w:tcW w:type="dxa" w:w="1728"/>
-          </w:tcPr>
-          <w:p>
-            <w:r>
-              <w:t>Bank operations</w:t>
-            </w:r>
-          </w:p>
-        </w:tc>
-        <w:tc>
-          <w:tcPr>
-            <w:tcW w:type="dxa" w:w="1728"/>
-          </w:tcPr>
-          <w:p>
-            <w:r>
-              <w:t>SA-ROLE-OPS</w:t>
-            </w:r>
-          </w:p>
-        </w:tc>
-      </w:tr>
-      <w:tr>
-        <w:tc>
-          <w:tcPr>
-            <w:tcW w:type="dxa" w:w="1728"/>
-          </w:tcPr>
-          <w:p>
-            <w:r>
-              <w:t>BR-006</w:t>
-            </w:r>
-          </w:p>
-        </w:tc>
-        <w:tc>
-          <w:tcPr>
-            <w:tcW w:type="dxa" w:w="1728"/>
-          </w:tcPr>
-          <w:p>
-            <w:r>
-              <w:t>Beneficiary management, notifications, and service requests are excluded from the v1 build.</w:t>
-            </w:r>
-          </w:p>
-        </w:tc>
-        <w:tc>
-          <w:tcPr>
-            <w:tcW w:type="dxa" w:w="1728"/>
-          </w:tcPr>
-          <w:p>
-            <w:r>
-              <w:t>Must</w:t>
-            </w:r>
-          </w:p>
-        </w:tc>
-        <w:tc>
-          <w:tcPr>
-            <w:tcW w:type="dxa" w:w="1728"/>
-          </w:tcPr>
-          <w:p>
-            <w:r>
-              <w:t>—</w:t>
-            </w:r>
-          </w:p>
-        </w:tc>
-        <w:tc>
-          <w:tcPr>
-            <w:tcW w:type="dxa" w:w="1728"/>
-          </w:tcPr>
-          <w:p>
-            <w:r>
-              <w:t>SA-OOS-1</w:t>
-            </w:r>
-          </w:p>
-        </w:tc>
-      </w:tr>
-      <w:tr>
-        <w:tc>
-          <w:tcPr>
-            <w:tcW w:type="dxa" w:w="1728"/>
-          </w:tcPr>
-          <w:p>
-            <w:r>
-              <w:t>BR-007</w:t>
-            </w:r>
-          </w:p>
-        </w:tc>
-        <w:tc>
-          <w:tcPr>
-            <w:tcW w:type="dxa" w:w="1728"/>
-          </w:tcPr>
-          <w:p>
-            <w:r>
-              <w:t>All account, KYC, and transfer state changes must be recorded with actor, action, and timestamp to support the Bank operations audit trail and defect root-cause analysis.</w:t>
-            </w:r>
-          </w:p>
-        </w:tc>
-        <w:tc>
-          <w:tcPr>
-            <w:tcW w:type="dxa" w:w="1728"/>
-          </w:tcPr>
-          <w:p>
-            <w:r>
-              <w:t>Must</w:t>
-            </w:r>
-          </w:p>
-        </w:tc>
-        <w:tc>
-          <w:tcPr>
-            <w:tcW w:type="dxa" w:w="1728"/>
-          </w:tcPr>
-          <w:p>
-            <w:r>
-              <w:t>Bank operations</w:t>
-            </w:r>
-          </w:p>
-        </w:tc>
-        <w:tc>
-          <w:tcPr>
-            <w:tcW w:type="dxa" w:w="1728"/>
-          </w:tcPr>
-          <w:p>
-            <w:r>
-              <w:t>SA-ROLE-OPS, CH-OBJ-2, CH-OBJ-6</w:t>
-            </w:r>
-          </w:p>
-        </w:tc>
-      </w:tr>
-      <w:tr>
-        <w:tc>
-          <w:tcPr>
-            <w:tcW w:type="dxa" w:w="1728"/>
-          </w:tcPr>
-          <w:p>
-            <w:r>
-              <w:t>BR-008</w:t>
-            </w:r>
-          </w:p>
-        </w:tc>
-        <w:tc>
-          <w:tcPr>
-            <w:tcW w:type="dxa" w:w="1728"/>
-          </w:tcPr>
-          <w:p>
-            <w:r>
-              <w:t>Agent-produced SDLC artifacts must be reviewable, reproducible, schema-valid, source-linked, and subject to human approval before being treated as approved.</w:t>
-            </w:r>
-          </w:p>
-        </w:tc>
-        <w:tc>
-          <w:tcPr>
-            <w:tcW w:type="dxa" w:w="1728"/>
-          </w:tcPr>
-          <w:p>
-            <w:r>
-              <w:t>Must</w:t>
-            </w:r>
-          </w:p>
-        </w:tc>
-        <w:tc>
-          <w:tcPr>
-            <w:tcW w:type="dxa" w:w="1728"/>
-          </w:tcPr>
-          <w:p>
-            <w:r>
-              <w:t>—</w:t>
-            </w:r>
-          </w:p>
-        </w:tc>
-        <w:tc>
-          <w:tcPr>
-            <w:tcW w:type="dxa" w:w="1728"/>
-          </w:tcPr>
-          <w:p>
-            <w:r>
-              <w:t>CH-OBJ-4</w:t>
-            </w:r>
-          </w:p>
-        </w:tc>
-      </w:tr>
-      <w:tr>
-        <w:tc>
-          <w:tcPr>
-            <w:tcW w:type="dxa" w:w="1728"/>
-          </w:tcPr>
-          <w:p>
-            <w:r>
-              <w:t>BR-009</w:t>
-            </w:r>
-          </w:p>
-        </w:tc>
-        <w:tc>
-          <w:tcPr>
-            <w:tcW w:type="dxa" w:w="1728"/>
-          </w:tcPr>
-          <w:p>
-            <w:r>
-              <w:t>Login and logout must be available to both Customer and Bank operations users, with role-based access control enforced.</w:t>
-            </w:r>
-          </w:p>
-        </w:tc>
-        <w:tc>
-          <w:tcPr>
-            <w:tcW w:type="dxa" w:w="1728"/>
-          </w:tcPr>
-          <w:p>
-            <w:r>
-              <w:t>Must</w:t>
-            </w:r>
-          </w:p>
-        </w:tc>
-        <w:tc>
-          <w:tcPr>
-            <w:tcW w:type="dxa" w:w="1728"/>
-          </w:tcPr>
-          <w:p>
-            <w:r>
-              <w:t>Customer, Bank operations</w:t>
-            </w:r>
-          </w:p>
-        </w:tc>
-        <w:tc>
-          <w:tcPr>
-            <w:tcW w:type="dxa" w:w="1728"/>
-          </w:tcPr>
-          <w:p>
-            <w:r>
-              <w:t>SA-3, SA-4, CH-OBJ-2</w:t>
-            </w:r>
-          </w:p>
-        </w:tc>
-      </w:tr>
-      <w:tr>
-        <w:tc>
-          <w:tcPr>
-            <w:tcW w:type="dxa" w:w="1728"/>
-          </w:tcPr>
-          <w:p>
-            <w:r>
-              <w:t>BR-010</w:t>
-            </w:r>
-          </w:p>
-        </w:tc>
-        <w:tc>
-          <w:tcPr>
-            <w:tcW w:type="dxa" w:w="1728"/>
-          </w:tcPr>
-          <w:p>
-            <w:r>
-              <w:t>Statement view is available to Customer and Bank operations; statement download is available to Customer only, in v1.</w:t>
-            </w:r>
-          </w:p>
-        </w:tc>
-        <w:tc>
-          <w:tcPr>
-            <w:tcW w:type="dxa" w:w="1728"/>
-          </w:tcPr>
-          <w:p>
-            <w:r>
-              <w:t>Must</w:t>
-            </w:r>
-          </w:p>
-        </w:tc>
-        <w:tc>
-          <w:tcPr>
-            <w:tcW w:type="dxa" w:w="1728"/>
-          </w:tcPr>
-          <w:p>
-            <w:r>
-              <w:t>Customer, Bank operations</w:t>
-            </w:r>
-          </w:p>
-        </w:tc>
-        <w:tc>
-          <w:tcPr>
-            <w:tcW w:type="dxa" w:w="1728"/>
-          </w:tcPr>
-          <w:p>
-            <w:r>
-              <w:t>SA-7, SA-8, SA-ROLE-CUST, SA-ROLE-OPS</w:t>
-            </w:r>
-          </w:p>
-        </w:tc>
-      </w:tr>
-      <w:tr>
-        <w:tc>
-          <w:tcPr>
-            <w:tcW w:type="dxa" w:w="1728"/>
-          </w:tcPr>
-          <w:p>
-            <w:r>
-              <w:t>BR-011</w:t>
-            </w:r>
-          </w:p>
-        </w:tc>
-        <w:tc>
-          <w:tcPr>
-            <w:tcW w:type="dxa" w:w="1728"/>
-          </w:tcPr>
-          <w:p>
-            <w:r>
-              <w:t>Security, privacy, accessibility, reliability, and testability apply as acceptance conditions to every in-scope Customer and Bank operations journey.</w:t>
-            </w:r>
-          </w:p>
-        </w:tc>
-        <w:tc>
-          <w:tcPr>
-            <w:tcW w:type="dxa" w:w="1728"/>
-          </w:tcPr>
-          <w:p>
-            <w:r>
-              <w:t>Must</w:t>
-            </w:r>
-          </w:p>
-        </w:tc>
-        <w:tc>
-          <w:tcPr>
-            <w:tcW w:type="dxa" w:w="1728"/>
-          </w:tcPr>
-          <w:p>
-            <w:r>
-              <w:t>—</w:t>
-            </w:r>
-          </w:p>
-        </w:tc>
-        <w:tc>
-          <w:tcPr>
-            <w:tcW w:type="dxa" w:w="1728"/>
-          </w:tcPr>
-          <w:p>
-            <w:r>
-              <w:t>CH-OBJ-5</w:t>
+              <w:t>Draft</w:t>
             </w:r>
           </w:p>
         </w:tc>
       </w:tr>
     </w:tbl>
-    <w:p>
-      <w:r>
-        <w:t xml:space="preserve">All rules are </w:t>
-      </w:r>
-      <w:r>
-        <w:rPr>
-          <w:b/>
-        </w:rPr>
-        <w:t>status: Draft</w:t>
-      </w:r>
-      <w:r>
-        <w:t>, pending human approval. Full detail (rationale) is in `business_rules.json`.</w:t>
-      </w:r>
-    </w:p>
     <w:p>
       <w:pPr>
         <w:pStyle w:val="Heading2"/>
@@ -1939,7 +1530,7 @@
     </w:p>
     <w:p>
       <w:r>
-        <w:t>Functional requirements are numbered F1–F10; non-functional requirements are numbered NF1–NF7. Each requirement lists its priority and the source_ids (business rules and/or scope_agreement.md items) it traces to. Full machine-readable detail is in `brd.json`.</w:t>
+        <w:t>Requirements are organized as Functional (F#) and Non-Functional (NF#), each tracing to one or more business rules (BR-xxx) and/or scope agreement items via source IDs.</w:t>
       </w:r>
     </w:p>
     <w:p>
@@ -1952,7 +1543,7 @@
     </w:p>
     <w:p>
       <w:r>
-        <w:t>1 = Must, 2 = Should, 3 = Could, F = Future, BP = Business Process. All requirements below are priority 1 (Must), reflecting that every item in section 5.1 is in scope for v1.</w:t>
+        <w:t>1 = Must, 2 = Should, 3 = Could, F = Future, BP = Business Process</w:t>
       </w:r>
     </w:p>
     <w:p>
@@ -2024,7 +1615,7 @@
               <w:rPr>
                 <w:b/>
               </w:rPr>
-              <w:t>Source</w:t>
+              <w:t>Source(s)</w:t>
             </w:r>
           </w:p>
         </w:tc>
@@ -2046,7 +1637,7 @@
           </w:tcPr>
           <w:p>
             <w:r>
-              <w:t>The system shall allow a Customer to register and complete KYC using Aadhaar and PAN identity documents, with format validation only (mocked verification).</w:t>
+              <w:t>The system shall allow a Customer to register and submit KYC details (Aadhaar, PAN) as part of onboarding.</w:t>
             </w:r>
           </w:p>
         </w:tc>
@@ -2066,7 +1657,7 @@
           </w:tcPr>
           <w:p>
             <w:r>
-              <w:t>SA-1, BR-001</w:t>
+              <w:t>SA-IN-1, BR-001</w:t>
             </w:r>
           </w:p>
         </w:tc>
@@ -2088,7 +1679,7 @@
           </w:tcPr>
           <w:p>
             <w:r>
-              <w:t>The system shall allow a Customer to onboard an account, and shall allow Bank operations to review and activate it before the account can be used.</w:t>
+              <w:t>The system shall perform a format-only validation of submitted Aadhaar and PAN numbers; no real government verification is performed.</w:t>
             </w:r>
           </w:p>
         </w:tc>
@@ -2108,7 +1699,7 @@
           </w:tcPr>
           <w:p>
             <w:r>
-              <w:t>SA-2, BR-002, SA-ROLE-OPS</w:t>
+              <w:t>SA-IN-1, SA-OUT-2, BR-001</w:t>
             </w:r>
           </w:p>
         </w:tc>
@@ -2130,7 +1721,7 @@
           </w:tcPr>
           <w:p>
             <w:r>
-              <w:t>The system shall allow Customer and Bank operations users to log in, with role-based access control applied.</w:t>
+              <w:t>The system shall allow a Bank operations user to review a Customer's submitted KYC and activate the associated account.</w:t>
             </w:r>
           </w:p>
         </w:tc>
@@ -2150,7 +1741,7 @@
           </w:tcPr>
           <w:p>
             <w:r>
-              <w:t>SA-3, BR-009</w:t>
+              <w:t>SA-IN-2, SA-ROLE-OPS, BR-002</w:t>
             </w:r>
           </w:p>
         </w:tc>
@@ -2172,7 +1763,7 @@
           </w:tcPr>
           <w:p>
             <w:r>
-              <w:t>The system shall allow Customer and Bank operations users to log out, terminating their authenticated session.</w:t>
+              <w:t>The system shall allow a Bank operations user to freeze an activated account.</w:t>
             </w:r>
           </w:p>
         </w:tc>
@@ -2192,7 +1783,7 @@
           </w:tcPr>
           <w:p>
             <w:r>
-              <w:t>SA-4, BR-009</w:t>
+              <w:t>SA-ROLE-OPS, BR-003</w:t>
             </w:r>
           </w:p>
         </w:tc>
@@ -2214,7 +1805,7 @@
           </w:tcPr>
           <w:p>
             <w:r>
-              <w:t>The system shall allow a Customer to initiate a synthetic money transfer to another account.</w:t>
+              <w:t>The system shall allow Customer and Bank operations users to log in with valid credentials.</w:t>
             </w:r>
           </w:p>
         </w:tc>
@@ -2234,7 +1825,7 @@
           </w:tcPr>
           <w:p>
             <w:r>
-              <w:t>SA-5, BR-003, BR-004</w:t>
+              <w:t>SA-IN-3, BR-008</w:t>
             </w:r>
           </w:p>
         </w:tc>
@@ -2256,7 +1847,7 @@
           </w:tcPr>
           <w:p>
             <w:r>
-              <w:t>The system shall allow a Customer's account to receive a synthetic money transfer.</w:t>
+              <w:t>The system shall allow Customer and Bank operations users to log out, terminating their active session.</w:t>
             </w:r>
           </w:p>
         </w:tc>
@@ -2276,7 +1867,7 @@
           </w:tcPr>
           <w:p>
             <w:r>
-              <w:t>SA-6, BR-003</w:t>
+              <w:t>SA-IN-4, BR-008</w:t>
             </w:r>
           </w:p>
         </w:tc>
@@ -2298,7 +1889,7 @@
           </w:tcPr>
           <w:p>
             <w:r>
-              <w:t>The system shall allow Customer and Bank operations users to view account statements according to their role permissions.</w:t>
+              <w:t>The system shall allow an authenticated Customer to initiate a synthetic money transfer from their account.</w:t>
             </w:r>
           </w:p>
         </w:tc>
@@ -2318,7 +1909,7 @@
           </w:tcPr>
           <w:p>
             <w:r>
-              <w:t>SA-7, BR-010</w:t>
+              <w:t>SA-IN-5, BR-004, BR-005</w:t>
             </w:r>
           </w:p>
         </w:tc>
@@ -2331,6 +1922,90 @@
           <w:p>
             <w:r>
               <w:t>F8</w:t>
+            </w:r>
+          </w:p>
+        </w:tc>
+        <w:tc>
+          <w:tcPr>
+            <w:tcW w:type="dxa" w:w="2160"/>
+          </w:tcPr>
+          <w:p>
+            <w:r>
+              <w:t>The system shall allow an authenticated Customer's account to receive a synthetic money transfer.</w:t>
+            </w:r>
+          </w:p>
+        </w:tc>
+        <w:tc>
+          <w:tcPr>
+            <w:tcW w:type="dxa" w:w="2160"/>
+          </w:tcPr>
+          <w:p>
+            <w:r>
+              <w:t>1</w:t>
+            </w:r>
+          </w:p>
+        </w:tc>
+        <w:tc>
+          <w:tcPr>
+            <w:tcW w:type="dxa" w:w="2160"/>
+          </w:tcPr>
+          <w:p>
+            <w:r>
+              <w:t>SA-IN-6, BR-005</w:t>
+            </w:r>
+          </w:p>
+        </w:tc>
+      </w:tr>
+      <w:tr>
+        <w:tc>
+          <w:tcPr>
+            <w:tcW w:type="dxa" w:w="2160"/>
+          </w:tcPr>
+          <w:p>
+            <w:r>
+              <w:t>F9</w:t>
+            </w:r>
+          </w:p>
+        </w:tc>
+        <w:tc>
+          <w:tcPr>
+            <w:tcW w:type="dxa" w:w="2160"/>
+          </w:tcPr>
+          <w:p>
+            <w:r>
+              <w:t>The system shall allow Customer and Bank operations users to view account statements.</w:t>
+            </w:r>
+          </w:p>
+        </w:tc>
+        <w:tc>
+          <w:tcPr>
+            <w:tcW w:type="dxa" w:w="2160"/>
+          </w:tcPr>
+          <w:p>
+            <w:r>
+              <w:t>1</w:t>
+            </w:r>
+          </w:p>
+        </w:tc>
+        <w:tc>
+          <w:tcPr>
+            <w:tcW w:type="dxa" w:w="2160"/>
+          </w:tcPr>
+          <w:p>
+            <w:r>
+              <w:t>SA-IN-7</w:t>
+            </w:r>
+          </w:p>
+        </w:tc>
+      </w:tr>
+      <w:tr>
+        <w:tc>
+          <w:tcPr>
+            <w:tcW w:type="dxa" w:w="2160"/>
+          </w:tcPr>
+          <w:p>
+            <w:r>
+              <w:t>F10</w:t>
             </w:r>
           </w:p>
         </w:tc>
@@ -2360,7 +2035,7 @@
           </w:tcPr>
           <w:p>
             <w:r>
-              <w:t>SA-8, BR-010, SA-ROLE-CUST</w:t>
+              <w:t>SA-IN-8, BR-004</w:t>
             </w:r>
           </w:p>
         </w:tc>
@@ -2372,7 +2047,7 @@
           </w:tcPr>
           <w:p>
             <w:r>
-              <w:t>F9</w:t>
+              <w:t>F11</w:t>
             </w:r>
           </w:p>
         </w:tc>
@@ -2382,7 +2057,7 @@
           </w:tcPr>
           <w:p>
             <w:r>
-              <w:t>The system shall allow Bank operations to view the audit trail of account and KYC state changes.</w:t>
+              <w:t>The system shall allow a Bank operations user to view an audit trail of account and transaction state changes.</w:t>
             </w:r>
           </w:p>
         </w:tc>
@@ -2392,7 +2067,7 @@
           </w:tcPr>
           <w:p>
             <w:r>
-              <w:t>1</w:t>
+              <w:t>2</w:t>
             </w:r>
           </w:p>
         </w:tc>
@@ -2402,7 +2077,7 @@
           </w:tcPr>
           <w:p>
             <w:r>
-              <w:t>SA-ROLE-OPS, BR-007</w:t>
+              <w:t>SA-ROLE-OPS, BR-007, CH-OBJ-2</w:t>
             </w:r>
           </w:p>
         </w:tc>
@@ -2414,7 +2089,7 @@
           </w:tcPr>
           <w:p>
             <w:r>
-              <w:t>F10</w:t>
+              <w:t>F12</w:t>
             </w:r>
           </w:p>
         </w:tc>
@@ -2444,7 +2119,7 @@
           </w:tcPr>
           <w:p>
             <w:r>
-              <w:t>SA-ROLE-OPS, BR-005</w:t>
+              <w:t>SA-ROLE-OPS, BR-003</w:t>
             </w:r>
           </w:p>
         </w:tc>
@@ -2519,7 +2194,7 @@
               <w:rPr>
                 <w:b/>
               </w:rPr>
-              <w:t>Source</w:t>
+              <w:t>Source(s)</w:t>
             </w:r>
           </w:p>
         </w:tc>
@@ -2541,7 +2216,7 @@
           </w:tcPr>
           <w:p>
             <w:r>
-              <w:t>The system shall require authentication for every Customer and Bank operations action, protecting account and identity data appropriate to a banking simulation.</w:t>
+              <w:t>All agent-produced and system-produced artifacts (requirements, code, tests, defect records) shall be reviewable, reproducible, schema-valid, and source-linked.</w:t>
             </w:r>
           </w:p>
         </w:tc>
@@ -2561,7 +2236,7 @@
           </w:tcPr>
           <w:p>
             <w:r>
-              <w:t>BR-011, CH-OBJ-5, BR-009</w:t>
+              <w:t>CH-OBJ-4</w:t>
             </w:r>
           </w:p>
         </w:tc>
@@ -2583,7 +2258,7 @@
           </w:tcPr>
           <w:p>
             <w:r>
-              <w:t>The system shall treat KYC and account data as sensitive and restrict access to it by role.</w:t>
+              <w:t>The system shall enforce role-based access control distinguishing Customer and Bank operations personas.</w:t>
             </w:r>
           </w:p>
         </w:tc>
@@ -2603,7 +2278,7 @@
           </w:tcPr>
           <w:p>
             <w:r>
-              <w:t>BR-011, SA-ROLE-OPS</w:t>
+              <w:t>CH-OBJ-2, SA-ROLE-CUST, SA-ROLE-OPS</w:t>
             </w:r>
           </w:p>
         </w:tc>
@@ -2625,7 +2300,7 @@
           </w:tcPr>
           <w:p>
             <w:r>
-              <w:t>Customer- and Bank-operations-facing interfaces shall meet accessibility requirements as an acceptance condition.</w:t>
+              <w:t>The system shall maintain an auditable record of state changes to accounts and transactions.</w:t>
             </w:r>
           </w:p>
         </w:tc>
@@ -2645,7 +2320,7 @@
           </w:tcPr>
           <w:p>
             <w:r>
-              <w:t>BR-011, CH-OBJ-5</w:t>
+              <w:t>CH-OBJ-2, BR-007</w:t>
             </w:r>
           </w:p>
         </w:tc>
@@ -2667,7 +2342,7 @@
           </w:tcPr>
           <w:p>
             <w:r>
-              <w:t>The system shall reliably persist account, KYC, and transaction state changes without data loss.</w:t>
+              <w:t>The system shall meet baseline security and privacy acceptance conditions for handling synthetic KYC and financial data.</w:t>
             </w:r>
           </w:p>
         </w:tc>
@@ -2687,7 +2362,7 @@
           </w:tcPr>
           <w:p>
             <w:r>
-              <w:t>BR-011, CH-OBJ-5</w:t>
+              <w:t>CH-OBJ-5</w:t>
             </w:r>
           </w:p>
         </w:tc>
@@ -2709,7 +2384,7 @@
           </w:tcPr>
           <w:p>
             <w:r>
-              <w:t>The system shall be built to be testable, including deterministic synthetic data and stable UI selectors for test automation.</w:t>
+              <w:t>The system shall meet baseline accessibility acceptance conditions for customer-facing journeys.</w:t>
             </w:r>
           </w:p>
         </w:tc>
@@ -2719,7 +2394,7 @@
           </w:tcPr>
           <w:p>
             <w:r>
-              <w:t>1</w:t>
+              <w:t>2</w:t>
             </w:r>
           </w:p>
         </w:tc>
@@ -2729,7 +2404,7 @@
           </w:tcPr>
           <w:p>
             <w:r>
-              <w:t>BR-011, OQ-004</w:t>
+              <w:t>CH-OBJ-5</w:t>
             </w:r>
           </w:p>
         </w:tc>
@@ -2751,7 +2426,7 @@
           </w:tcPr>
           <w:p>
             <w:r>
-              <w:t>All account, KYC, and transfer state changes shall be recorded with actor, action, and timestamp to support audit-trail viewing and defect root-cause analysis.</w:t>
+              <w:t>The system shall be designed for testability, enabling automated system-test and defect root-cause-analysis workflows.</w:t>
             </w:r>
           </w:p>
         </w:tc>
@@ -2771,7 +2446,7 @@
           </w:tcPr>
           <w:p>
             <w:r>
-              <w:t>CH-OBJ-2, CH-OBJ-6, BR-007</w:t>
+              <w:t>CH-OBJ-5, CH-OBJ-3</w:t>
             </w:r>
           </w:p>
         </w:tc>
@@ -2793,7 +2468,7 @@
           </w:tcPr>
           <w:p>
             <w:r>
-              <w:t>Every approved business rule shall be traceable through requirement, design, implementation, test, and evidence record, and all agent-produced artifacts shall be reviewable, reproducible, schema-valid, source-linked, and subject to human approval.</w:t>
+              <w:t>The system shall support a level of reliability appropriate to a simulated banking workload.</w:t>
             </w:r>
           </w:p>
         </w:tc>
@@ -2803,7 +2478,7 @@
           </w:tcPr>
           <w:p>
             <w:r>
-              <w:t>1</w:t>
+              <w:t>2</w:t>
             </w:r>
           </w:p>
         </w:tc>
@@ -2813,7 +2488,49 @@
           </w:tcPr>
           <w:p>
             <w:r>
-              <w:t>CH-PROB-2, CH-OBJ-4, CH-OBJ-6, BR-008</w:t>
+              <w:t>CH-OBJ-5</w:t>
+            </w:r>
+          </w:p>
+        </w:tc>
+      </w:tr>
+      <w:tr>
+        <w:tc>
+          <w:tcPr>
+            <w:tcW w:type="dxa" w:w="2160"/>
+          </w:tcPr>
+          <w:p>
+            <w:r>
+              <w:t>NF8</w:t>
+            </w:r>
+          </w:p>
+        </w:tc>
+        <w:tc>
+          <w:tcPr>
+            <w:tcW w:type="dxa" w:w="2160"/>
+          </w:tcPr>
+          <w:p>
+            <w:r>
+              <w:t>Changes to requirements and business rules shall follow versioning and change-control governance.</w:t>
+            </w:r>
+          </w:p>
+        </w:tc>
+        <w:tc>
+          <w:tcPr>
+            <w:tcW w:type="dxa" w:w="2160"/>
+          </w:tcPr>
+          <w:p>
+            <w:r>
+              <w:t>2</w:t>
+            </w:r>
+          </w:p>
+        </w:tc>
+        <w:tc>
+          <w:tcPr>
+            <w:tcW w:type="dxa" w:w="2160"/>
+          </w:tcPr>
+          <w:p>
+            <w:r>
+              <w:t>CH-OBJ-6</w:t>
             </w:r>
           </w:p>
         </w:tc>
@@ -2829,7 +2546,7 @@
     </w:p>
     <w:p>
       <w:r>
-        <w:t>Not yet defined. Implementation-level decisions (data model, screen flows, API/service boundaries, environment/config) are owned by the technical design/coding stage and are out of scope for this BRD; they must trace back to the business rules and requirements in sections 6–7.</w:t>
+        <w:t>Downstream stages must preserve traceability from each business rule and requirement through design, code, unit tests, system tests, and defect records. Agent-produced artifacts at every stage must remain schema-valid, source-linked, and reviewable, and must be submitted for human approval before being treated as approved (per Objective 4).</w:t>
       </w:r>
     </w:p>
     <w:p>
@@ -2842,7 +2559,39 @@
     </w:p>
     <w:p>
       <w:r>
-        <w:t>Open questions carried forward verbatim from `scope_agreement.md` — no answers are assumed:</w:t>
+        <w:t>See Section 10 for the open questions carried forward from scope_agreement.md; none of them are yet answered. Resolution is required before the corresponding requirements (noted below) can be finalized:</w:t>
+      </w:r>
+    </w:p>
+    <w:p>
+      <w:pPr>
+        <w:pStyle w:val="ListBullet"/>
+      </w:pPr>
+      <w:r>
+        <w:t>OQ-002 and OQ-003 affect the precise transfer behavior underlying F7.</w:t>
+      </w:r>
+    </w:p>
+    <w:p>
+      <w:pPr>
+        <w:pStyle w:val="ListBullet"/>
+      </w:pPr>
+      <w:r>
+        <w:t>OQ-004 affects the test-automation approach underlying NF6.</w:t>
+      </w:r>
+    </w:p>
+    <w:p>
+      <w:pPr>
+        <w:pStyle w:val="ListBullet"/>
+      </w:pPr>
+      <w:r>
+        <w:t>OQ-001 affects the handover and acceptance process (Section 10).</w:t>
+      </w:r>
+    </w:p>
+    <w:p>
+      <w:pPr>
+        <w:pStyle w:val="Heading2"/>
+      </w:pPr>
+      <w:r>
+        <w:t>10. Handover</w:t>
       </w:r>
     </w:p>
     <w:tbl>
@@ -2938,7 +2687,7 @@
           </w:tcPr>
           <w:p>
             <w:r>
-              <w:t>TBD</w:t>
+              <w:t>Unassigned</w:t>
             </w:r>
           </w:p>
         </w:tc>
@@ -2948,7 +2697,7 @@
           </w:tcPr>
           <w:p>
             <w:r>
-              <w:t>Acceptance sign-off / UAT execution for all in-scope journeys</w:t>
+              <w:t>Handover; acceptance of Customer and Bank operations journeys</w:t>
             </w:r>
           </w:p>
         </w:tc>
@@ -2980,7 +2729,7 @@
           </w:tcPr>
           <w:p>
             <w:r>
-              <w:t>TBD</w:t>
+              <w:t>Unassigned</w:t>
             </w:r>
           </w:p>
         </w:tc>
@@ -2990,7 +2739,7 @@
           </w:tcPr>
           <w:p>
             <w:r>
-              <w:t>Account activation and money-transfer validation rules (minimum balance enforcement) — F2, F5</w:t>
+              <w:t>F7, F8, BR-005</w:t>
             </w:r>
           </w:p>
         </w:tc>
@@ -3022,7 +2771,7 @@
           </w:tcPr>
           <w:p>
             <w:r>
-              <w:t>TBD</w:t>
+              <w:t>Unassigned</w:t>
             </w:r>
           </w:p>
         </w:tc>
@@ -3032,7 +2781,7 @@
           </w:tcPr>
           <w:p>
             <w:r>
-              <w:t>Money-transfer limit business rule and validation — F5</w:t>
+              <w:t>F7, BR-005</w:t>
             </w:r>
           </w:p>
         </w:tc>
@@ -3064,7 +2813,7 @@
           </w:tcPr>
           <w:p>
             <w:r>
-              <w:t>TBD</w:t>
+              <w:t>Unassigned</w:t>
             </w:r>
           </w:p>
         </w:tc>
@@ -3074,42 +2823,15 @@
           </w:tcPr>
           <w:p>
             <w:r>
-              <w:t>System-test/automation agent's selector strategy — NF5 (testability)</w:t>
+              <w:t>NF6</w:t>
             </w:r>
           </w:p>
         </w:tc>
       </w:tr>
     </w:tbl>
     <w:p>
-      <w:pPr>
-        <w:pStyle w:val="Heading2"/>
-      </w:pPr>
       <w:r>
-        <w:t>10. Handover</w:t>
-      </w:r>
-    </w:p>
-    <w:p>
-      <w:r>
-        <w:t xml:space="preserve">This BRD, `brd.json`, `business_rules.json`, and `open_questions.json` are all </w:t>
-      </w:r>
-      <w:r>
-        <w:rPr>
-          <w:b/>
-        </w:rPr>
-        <w:t>DRAFT</w:t>
-      </w:r>
-      <w:r>
-        <w:t>, pending human approval — nothing in this package should be treated as approved. Once approved, this package is the input to the next Group 2 SDLC stage (technical design/coding/unit-test agent). The four open questions above should be resolved, or explicitly deferred with owner and target date, before or during that handover.</w:t>
-      </w:r>
-    </w:p>
-    <w:p>
-      <w:r>
-        <w:t>---</w:t>
-      </w:r>
-    </w:p>
-    <w:p>
-      <w:r>
-        <w:t>*Source ID key: `SA-1`…`SA-8` = scope_agreement.md in-scope items 1–8; `SA-OOS-1`…`SA-OOS-3` = scope_agreement.md out-of-scope items 1–3; `SA-ROLE-CUST` / `SA-ROLE-OPS` = scope_agreement.md role definitions; `CH-PROB-1`/`CH-PROB-2` = charter.md §1.1 problem statement paragraphs 1–2; `CH-OBJ-1`…`CH-OBJ-7` = charter.md §1.2 objectives 1–7; `OQ-xxx` = open_questions.json; `BR-xxx` = business_rules.json.*</w:t>
+        <w:t>This BRD is DRAFT and requires human approval before handover to the design/build stage. All open questions above must be resolved or explicitly deferred by the approving stakeholder before downstream agents treat this document as a baseline.</w:t>
       </w:r>
     </w:p>
     <w:sectPr>

</xml_diff>

<commit_message>
Full honest re-run: brd-agent -> frd-agent -> uat-generator
The BR-006 type-field fix in the previous commit was hand-patched
onto business_rules.json instead of actually regenerated by
brd-agent, which breaks this project's own premise (agents do the
work, humans validate). Redone properly: re-ran all three stages in
sequence with the updated skills, each reading only the prior
stage's approved output.

brd-agent's fresh run produced materially different content, not a
patch: 20 business rules (was 11), 23 requirements F1-F17/NF1-NF6
(was 17). Reviewed and accepted as the new canonical BRD, then
cascaded frd-agent (23 FR entries, 14 errors) and uat-generator
(52 acceptance criteria, 46 UAT cases) on top of it.

coverage_report.json: PASS, 100% traceability, 5 rules correctly
in excluded_rules[] (BR-003, BR-008, BR-015, BR-016, BR-017).
</commit_message>
<xml_diff>
--- a/shared_outputs/BRD.docx
+++ b/shared_outputs/BRD.docx
@@ -8,22 +8,6 @@
       </w:pPr>
       <w:r>
         <w:t>Business Requirements Document</w:t>
-      </w:r>
-    </w:p>
-    <w:p>
-      <w:pPr>
-        <w:pStyle w:val="Heading2"/>
-      </w:pPr>
-      <w:r>
-        <w:t>Business Requirements Document — Online Banking Simulation v1</w:t>
-      </w:r>
-    </w:p>
-    <w:p>
-      <w:r>
-        <w:rPr>
-          <w:b/>
-        </w:rPr>
-        <w:t>Status: DRAFT — pending human approval. Version: 1.0-draft.</w:t>
       </w:r>
     </w:p>
     <w:p>
@@ -44,7 +28,16 @@
     </w:p>
     <w:p>
       <w:r>
-        <w:t>This document captures the business requirements for v1 of the Online Banking Simulation: a synthetic online-banking application built as part of an end-to-end student SDLC project. It translates the approved project charter and scope agreement into scoped business rules and traceable functional and non-functional requirements, so that downstream design, build, test, and defect-analysis agents can work from a single, source-linked baseline.</w:t>
+        <w:t xml:space="preserve">This Business Requirements Document (BRD) captures the business rules, functional requirements, and non-functional requirements for v1 of the Online Banking Simulation, a student end-to-end SDLC project. It is generated by the brd-agent from the project charter and the scope agreement, and is the traceability root for downstream design, code, test, and defect-analysis artifacts. This document is </w:t>
+      </w:r>
+      <w:r>
+        <w:rPr>
+          <w:b/>
+        </w:rPr>
+        <w:t>DRAFT</w:t>
+      </w:r>
+      <w:r>
+        <w:t xml:space="preserve"> and pending human approval.</w:t>
       </w:r>
     </w:p>
     <w:p>
@@ -57,7 +50,7 @@
     </w:p>
     <w:p>
       <w:r>
-        <w:t>Business Analysis, Architecture/Development, Quality Assurance/Testing, and Defect Root-Cause-Analysis teams (and their supporting agents), plus the human reviewers who approve this document.</w:t>
+        <w:t>Business Analysis (Ritu &amp; Team), Architecture/Development (Mohit &amp; Team), Quality Assurance &amp; Testing (Mandeep &amp; Team), Defect Root-Cause Analysis (Adiba &amp; Team), and the downstream agent families that consume this BRD as an input (technical design/coding/unit testing, system-test/automation, defect root-cause analysis).</w:t>
       </w:r>
     </w:p>
     <w:p>
@@ -73,7 +66,7 @@
         <w:pStyle w:val="ListBullet"/>
       </w:pPr>
       <w:r>
-        <w:t>charter.md — Project charter (problem statement and objectives)</w:t>
+        <w:t>charter.md — Project charter for the Online Banking Application student project</w:t>
       </w:r>
     </w:p>
     <w:p>
@@ -81,7 +74,7 @@
         <w:pStyle w:val="ListBullet"/>
       </w:pPr>
       <w:r>
-        <w:t>scope_agreement.md — Scope Agreement — Online Banking Simulation v1 (v1.0, DRAFT)</w:t>
+        <w:t>scope_agreement.md — Scope Agreement — Online Banking Simulation v1 (Version 1.0, Status: DRAFT)</w:t>
       </w:r>
     </w:p>
     <w:p>
@@ -89,7 +82,7 @@
         <w:pStyle w:val="ListBullet"/>
       </w:pPr>
       <w:r>
-        <w:t>BRD_template.txt — Business Requirements Document template</w:t>
+        <w:t>BRD_template.txt — Business Requirements Document template used for this document's structure</w:t>
       </w:r>
     </w:p>
     <w:p>
@@ -221,7 +214,7 @@
           </w:tcPr>
           <w:p>
             <w:r>
-              <w:t>Indian government-issued identity number</w:t>
+              <w:t>Indian national identity number</w:t>
             </w:r>
           </w:p>
         </w:tc>
@@ -233,7 +226,7 @@
           </w:tcPr>
           <w:p>
             <w:r>
-              <w:t>UAT</w:t>
+              <w:t>SDLC</w:t>
             </w:r>
           </w:p>
         </w:tc>
@@ -243,7 +236,7 @@
           </w:tcPr>
           <w:p>
             <w:r>
-              <w:t>User Acceptance Testing</w:t>
+              <w:t>Software Development Life Cycle</w:t>
             </w:r>
           </w:p>
         </w:tc>
@@ -255,7 +248,7 @@
           </w:tcPr>
           <w:p>
             <w:r>
-              <w:t>SDLC</w:t>
+              <w:t>UAT</w:t>
             </w:r>
           </w:p>
         </w:tc>
@@ -265,7 +258,7 @@
           </w:tcPr>
           <w:p>
             <w:r>
-              <w:t>Software Development Life Cycle</w:t>
+              <w:t>User Acceptance Testing</w:t>
             </w:r>
           </w:p>
         </w:tc>
@@ -299,7 +292,7 @@
           </w:tcPr>
           <w:p>
             <w:r>
-              <w:t>F#/NF#</w:t>
+              <w:t>F / NF</w:t>
             </w:r>
           </w:p>
         </w:tc>
@@ -309,7 +302,7 @@
           </w:tcPr>
           <w:p>
             <w:r>
-              <w:t>Functional / Non-Functional requirement identifier</w:t>
+              <w:t>Functional / Non-Functional requirement</w:t>
             </w:r>
           </w:p>
         </w:tc>
@@ -332,6 +325,28 @@
           <w:p>
             <w:r>
               <w:t>Open Question</w:t>
+            </w:r>
+          </w:p>
+        </w:tc>
+      </w:tr>
+      <w:tr>
+        <w:tc>
+          <w:tcPr>
+            <w:tcW w:type="dxa" w:w="4320"/>
+          </w:tcPr>
+          <w:p>
+            <w:r>
+              <w:t>PII</w:t>
+            </w:r>
+          </w:p>
+        </w:tc>
+        <w:tc>
+          <w:tcPr>
+            <w:tcW w:type="dxa" w:w="4320"/>
+          </w:tcPr>
+          <w:p>
+            <w:r>
+              <w:t>Personally Identifiable Information</w:t>
             </w:r>
           </w:p>
         </w:tc>
@@ -355,7 +370,7 @@
     </w:p>
     <w:p>
       <w:r>
-        <w:t>Customers expect secure digital access to onboarding, accounts, beneficiaries, transfers, statements, notifications, and service requests. Building even a simplified version requires coordinated business analysis, architecture, engineering, testing, evidence management, and defect triage. Student projects often treat these as isolated activities, causing ambiguous requirements, untestable designs, weak handoffs, and disagreement over whether failures are defects or new requests. This project asks four groups to create both an online-banking simulation and specialized agents that support a traceable SDLC, so that an approved business rule can be shown to flow through to a requirement, design element, implementation, test, defect decision, and final evidence record.</w:t>
+        <w:t>Customers expect secure digital access to onboarding, accounts, beneficiaries, transfers, statements, notifications, and service requests. Building even a simplified version requires coordinated business analysis, architecture, engineering, testing, evidence management, and defect triage. Student projects often treat these as isolated activities, causing ambiguous requirements, untestable designs, weak handoffs, and disagreement over whether failures are defects or new requests. The project asks four groups to create both an online-banking simulation and specialized agents that support a traceable SDLC, so that an approved business rule can be shown to become a requirement, design element, implementation, test, defect decision, and final evidence record.</w:t>
       </w:r>
     </w:p>
     <w:p>
@@ -379,7 +394,7 @@
         <w:pStyle w:val="ListNumber"/>
       </w:pPr>
       <w:r>
-        <w:t>Demonstrate customer and bank-operations journeys with role-based access and auditable state changes.</w:t>
+        <w:t>Demonstrate customer and bank-operations' journeys with role-based access and auditable state changes.</w:t>
       </w:r>
     </w:p>
     <w:p>
@@ -403,7 +418,7 @@
         <w:pStyle w:val="ListNumber"/>
       </w:pPr>
       <w:r>
-        <w:t>Use security, privacy, accessibility, reliability, and testability as acceptance conditions, not optional polish.</w:t>
+        <w:t>Use security, privacy, accessibility, reliability, and testability as acceptance conditions — not optional polish.</w:t>
       </w:r>
     </w:p>
     <w:p>
@@ -455,7 +470,7 @@
               <w:rPr>
                 <w:b/>
               </w:rPr>
-              <w:t>Persona</w:t>
+              <w:t>Role in project</w:t>
             </w:r>
           </w:p>
         </w:tc>
@@ -477,7 +492,7 @@
           </w:tcPr>
           <w:p>
             <w:r>
-              <w:t>Business Analysis</w:t>
+              <w:t>Business Analysis persona</w:t>
             </w:r>
           </w:p>
         </w:tc>
@@ -499,7 +514,7 @@
           </w:tcPr>
           <w:p>
             <w:r>
-              <w:t>Architecture &amp; Build and Unit Test (Development)</w:t>
+              <w:t>Architecture, Build &amp; Unit Test / Development persona</w:t>
             </w:r>
           </w:p>
         </w:tc>
@@ -521,7 +536,7 @@
           </w:tcPr>
           <w:p>
             <w:r>
-              <w:t>Quality Assurance &amp; Testing</w:t>
+              <w:t>Quality Assurance &amp; Testing persona</w:t>
             </w:r>
           </w:p>
         </w:tc>
@@ -543,7 +558,51 @@
           </w:tcPr>
           <w:p>
             <w:r>
-              <w:t>Defect Root Cause Analysis</w:t>
+              <w:t>Defect Root-Cause Analysis persona</w:t>
+            </w:r>
+          </w:p>
+        </w:tc>
+      </w:tr>
+      <w:tr>
+        <w:tc>
+          <w:tcPr>
+            <w:tcW w:type="dxa" w:w="4320"/>
+          </w:tcPr>
+          <w:p>
+            <w:r>
+              <w:t>Customer</w:t>
+            </w:r>
+          </w:p>
+        </w:tc>
+        <w:tc>
+          <w:tcPr>
+            <w:tcW w:type="dxa" w:w="4320"/>
+          </w:tcPr>
+          <w:p>
+            <w:r>
+              <w:t>End-user role of the simulated banking application</w:t>
+            </w:r>
+          </w:p>
+        </w:tc>
+      </w:tr>
+      <w:tr>
+        <w:tc>
+          <w:tcPr>
+            <w:tcW w:type="dxa" w:w="4320"/>
+          </w:tcPr>
+          <w:p>
+            <w:r>
+              <w:t>Bank operations</w:t>
+            </w:r>
+          </w:p>
+        </w:tc>
+        <w:tc>
+          <w:tcPr>
+            <w:tcW w:type="dxa" w:w="4320"/>
+          </w:tcPr>
+          <w:p>
+            <w:r>
+              <w:t>End-user role of the simulated banking application</w:t>
             </w:r>
           </w:p>
         </w:tc>
@@ -562,47 +621,23 @@
         <w:rPr>
           <w:b/>
         </w:rPr>
-        <w:t>Assumptions:</w:t>
+        <w:t>Constraints</w:t>
       </w:r>
     </w:p>
     <w:p>
       <w:pPr>
-        <w:pStyle w:val="ListNumber"/>
+        <w:pStyle w:val="ListBullet"/>
       </w:pPr>
       <w:r>
-        <w:t>All customer identities, accounts, balances, and transactions used in the simulation are synthetic, not real personal or financial data.</w:t>
+        <w:t>No real money movement is permitted; all funds, balances, and transactions are synthetic (source: SA-OOS3).</w:t>
       </w:r>
     </w:p>
     <w:p>
       <w:pPr>
-        <w:pStyle w:val="ListNumber"/>
+        <w:pStyle w:val="ListBullet"/>
       </w:pPr>
       <w:r>
-        <w:t>KYC verification (Aadhaar, PAN) is a format-only check; there is no integration with real government verification systems.</w:t>
-      </w:r>
-    </w:p>
-    <w:p>
-      <w:pPr>
-        <w:pStyle w:val="ListNumber"/>
-      </w:pPr>
-      <w:r>
-        <w:t>All money movement is synthetic; no real funds are ever transferred.</w:t>
-      </w:r>
-    </w:p>
-    <w:p>
-      <w:pPr>
-        <w:pStyle w:val="ListNumber"/>
-      </w:pPr>
-      <w:r>
-        <w:t>The Business Analysis, Architecture/Development, QA/Testing, and Defect Root-Cause-Analysis personas are played by the named student teams for the duration of this project.</w:t>
-      </w:r>
-    </w:p>
-    <w:p>
-      <w:pPr>
-        <w:pStyle w:val="ListNumber"/>
-      </w:pPr>
-      <w:r>
-        <w:t>Beneficiary management, notifications, and service requests are deferred beyond v1 and are not required for this BRD.</w:t>
+        <w:t>No real Aadhaar/PAN verification service may be integrated; identity checks are format validation only (source: SA-OOS2).</w:t>
       </w:r>
     </w:p>
     <w:p>
@@ -610,10 +645,79 @@
         <w:rPr>
           <w:b/>
         </w:rPr>
-        <w:t>Dependencies:</w:t>
+        <w:t>Assumptions</w:t>
       </w:r>
+    </w:p>
+    <w:p>
+      <w:pPr>
+        <w:pStyle w:val="ListBullet"/>
+      </w:pPr>
       <w:r>
-        <w:t xml:space="preserve"> This BRD has no upstream `approved/` dependency; charter.md, scope_agreement.md, and BRD_template.txt are its only inputs.</w:t>
+        <w:t>Aadhaar and PAN are the only KYC identifier types required for v1 onboarding.</w:t>
+      </w:r>
+    </w:p>
+    <w:p>
+      <w:pPr>
+        <w:pStyle w:val="ListBullet"/>
+      </w:pPr>
+      <w:r>
+        <w:t>Account balances, identities, and transactions are entirely synthetic; no integration with real banking rails or identity-verification providers is required.</w:t>
+      </w:r>
+    </w:p>
+    <w:p>
+      <w:pPr>
+        <w:pStyle w:val="ListBullet"/>
+      </w:pPr>
+      <w:r>
+        <w:t>"Login" and "Logout" apply uniformly to both Customer and Bank operations roles unless a role-specific journey is later defined.</w:t>
+      </w:r>
+    </w:p>
+    <w:p>
+      <w:pPr>
+        <w:pStyle w:val="ListBullet"/>
+      </w:pPr>
+      <w:r>
+        <w:t>Minimum balance, daily transfer cap, and UAT ownership are unresolved; no default values are assumed until they are answered (see OQ-001, OQ-002, OQ-003).</w:t>
+      </w:r>
+    </w:p>
+    <w:p>
+      <w:pPr>
+        <w:pStyle w:val="ListBullet"/>
+      </w:pPr>
+      <w:r>
+        <w:t>The data-testid naming convention for automated testing is pending confirmation (OQ-004); these requirements do not depend on a specific convention.</w:t>
+      </w:r>
+    </w:p>
+    <w:p>
+      <w:pPr>
+        <w:pStyle w:val="ListBullet"/>
+      </w:pPr>
+      <w:r>
+        <w:t>Beneficiary management referenced in the charter's broader vision is deferred beyond v1, consistent with the scope agreement's exclusion.</w:t>
+      </w:r>
+    </w:p>
+    <w:p>
+      <w:r>
+        <w:rPr>
+          <w:b/>
+        </w:rPr>
+        <w:t>Dependencies</w:t>
+      </w:r>
+    </w:p>
+    <w:p>
+      <w:pPr>
+        <w:pStyle w:val="ListBullet"/>
+      </w:pPr>
+      <w:r>
+        <w:t>This BRD is Stage 1 of the Group 2 SDLC pipeline; there is no upstream `approved/` dependency for this run — charter.md, scope_agreement.md, and BRD_template.txt are the only inputs.</w:t>
+      </w:r>
+    </w:p>
+    <w:p>
+      <w:pPr>
+        <w:pStyle w:val="ListBullet"/>
+      </w:pPr>
+      <w:r>
+        <w:t>Downstream design, coding, testing, and defect-analysis agents depend on this BRD, business_rules.json, and open_questions.json for traceability.</w:t>
       </w:r>
     </w:p>
     <w:p>
@@ -626,7 +730,7 @@
     </w:p>
     <w:p>
       <w:r>
-        <w:t>There is no pre-existing online banking system for this project. This is a greenfield build; there is no legacy state to migrate from.</w:t>
+        <w:t>There is no existing system. This is a greenfield student project building the Online Banking Simulation v1 from the charter and scope agreement; no legacy platform, prior release, or current-state process is being replaced.</w:t>
       </w:r>
     </w:p>
     <w:p>
@@ -645,70 +749,315 @@
         <w:t>5.1 In Scope</w:t>
       </w:r>
     </w:p>
-    <w:p>
-      <w:pPr>
-        <w:pStyle w:val="ListNumber"/>
-      </w:pPr>
-      <w:r>
-        <w:t>Customer on-boarding with KYC (Aadhaar, PAN) — Customer, Bank operations</w:t>
-      </w:r>
-    </w:p>
-    <w:p>
-      <w:pPr>
-        <w:pStyle w:val="ListNumber"/>
-      </w:pPr>
-      <w:r>
-        <w:t>Account on-boarding and activation — Customer, Bank operations</w:t>
-      </w:r>
-    </w:p>
-    <w:p>
-      <w:pPr>
-        <w:pStyle w:val="ListNumber"/>
-      </w:pPr>
-      <w:r>
-        <w:t>Login — Customer, Bank operations</w:t>
-      </w:r>
-    </w:p>
-    <w:p>
-      <w:pPr>
-        <w:pStyle w:val="ListNumber"/>
-      </w:pPr>
-      <w:r>
-        <w:t>Logout — Customer, Bank operations</w:t>
-      </w:r>
-    </w:p>
-    <w:p>
-      <w:pPr>
-        <w:pStyle w:val="ListNumber"/>
-      </w:pPr>
-      <w:r>
-        <w:t>Money transfer — Customer</w:t>
-      </w:r>
-    </w:p>
-    <w:p>
-      <w:pPr>
-        <w:pStyle w:val="ListNumber"/>
-      </w:pPr>
-      <w:r>
-        <w:t>Money receive — Customer</w:t>
-      </w:r>
-    </w:p>
-    <w:p>
-      <w:pPr>
-        <w:pStyle w:val="ListNumber"/>
-      </w:pPr>
-      <w:r>
-        <w:t>Statement view — Customer, Bank operations</w:t>
-      </w:r>
-    </w:p>
-    <w:p>
-      <w:pPr>
-        <w:pStyle w:val="ListNumber"/>
-      </w:pPr>
-      <w:r>
-        <w:t>Statement download — Customer</w:t>
-      </w:r>
-    </w:p>
+    <w:tbl>
+      <w:tblPr>
+        <w:tblStyle w:val="LightGrid-Accent1"/>
+        <w:tblW w:type="auto" w:w="0"/>
+        <w:tblLook w:firstColumn="1" w:firstRow="1" w:lastColumn="0" w:lastRow="0" w:noHBand="0" w:noVBand="1" w:val="04A0"/>
+      </w:tblPr>
+      <w:tblGrid>
+        <w:gridCol w:w="2880"/>
+        <w:gridCol w:w="2880"/>
+        <w:gridCol w:w="2880"/>
+      </w:tblGrid>
+      <w:tr>
+        <w:tc>
+          <w:tcPr>
+            <w:tcW w:type="dxa" w:w="2880"/>
+          </w:tcPr>
+          <w:p>
+            <w:r>
+              <w:rPr>
+                <w:b/>
+              </w:rPr>
+              <w:t>#</w:t>
+            </w:r>
+          </w:p>
+        </w:tc>
+        <w:tc>
+          <w:tcPr>
+            <w:tcW w:type="dxa" w:w="2880"/>
+          </w:tcPr>
+          <w:p>
+            <w:r>
+              <w:rPr>
+                <w:b/>
+              </w:rPr>
+              <w:t>Item</w:t>
+            </w:r>
+          </w:p>
+        </w:tc>
+        <w:tc>
+          <w:tcPr>
+            <w:tcW w:type="dxa" w:w="2880"/>
+          </w:tcPr>
+          <w:p>
+            <w:r>
+              <w:rPr>
+                <w:b/>
+              </w:rPr>
+              <w:t>Roles</w:t>
+            </w:r>
+          </w:p>
+        </w:tc>
+      </w:tr>
+      <w:tr>
+        <w:tc>
+          <w:tcPr>
+            <w:tcW w:type="dxa" w:w="2880"/>
+          </w:tcPr>
+          <w:p>
+            <w:r>
+              <w:t>1</w:t>
+            </w:r>
+          </w:p>
+        </w:tc>
+        <w:tc>
+          <w:tcPr>
+            <w:tcW w:type="dxa" w:w="2880"/>
+          </w:tcPr>
+          <w:p>
+            <w:r>
+              <w:t>Customer on-boarding with KYC (Aadhaar, PAN)</w:t>
+            </w:r>
+          </w:p>
+        </w:tc>
+        <w:tc>
+          <w:tcPr>
+            <w:tcW w:type="dxa" w:w="2880"/>
+          </w:tcPr>
+          <w:p>
+            <w:r>
+              <w:t>Customer, Bank operations</w:t>
+            </w:r>
+          </w:p>
+        </w:tc>
+      </w:tr>
+      <w:tr>
+        <w:tc>
+          <w:tcPr>
+            <w:tcW w:type="dxa" w:w="2880"/>
+          </w:tcPr>
+          <w:p>
+            <w:r>
+              <w:t>2</w:t>
+            </w:r>
+          </w:p>
+        </w:tc>
+        <w:tc>
+          <w:tcPr>
+            <w:tcW w:type="dxa" w:w="2880"/>
+          </w:tcPr>
+          <w:p>
+            <w:r>
+              <w:t>Account on-boarding and activation</w:t>
+            </w:r>
+          </w:p>
+        </w:tc>
+        <w:tc>
+          <w:tcPr>
+            <w:tcW w:type="dxa" w:w="2880"/>
+          </w:tcPr>
+          <w:p>
+            <w:r>
+              <w:t>Customer, Bank operations</w:t>
+            </w:r>
+          </w:p>
+        </w:tc>
+      </w:tr>
+      <w:tr>
+        <w:tc>
+          <w:tcPr>
+            <w:tcW w:type="dxa" w:w="2880"/>
+          </w:tcPr>
+          <w:p>
+            <w:r>
+              <w:t>3</w:t>
+            </w:r>
+          </w:p>
+        </w:tc>
+        <w:tc>
+          <w:tcPr>
+            <w:tcW w:type="dxa" w:w="2880"/>
+          </w:tcPr>
+          <w:p>
+            <w:r>
+              <w:t>Login</w:t>
+            </w:r>
+          </w:p>
+        </w:tc>
+        <w:tc>
+          <w:tcPr>
+            <w:tcW w:type="dxa" w:w="2880"/>
+          </w:tcPr>
+          <w:p>
+            <w:r>
+              <w:t>Customer, Bank operations</w:t>
+            </w:r>
+          </w:p>
+        </w:tc>
+      </w:tr>
+      <w:tr>
+        <w:tc>
+          <w:tcPr>
+            <w:tcW w:type="dxa" w:w="2880"/>
+          </w:tcPr>
+          <w:p>
+            <w:r>
+              <w:t>4</w:t>
+            </w:r>
+          </w:p>
+        </w:tc>
+        <w:tc>
+          <w:tcPr>
+            <w:tcW w:type="dxa" w:w="2880"/>
+          </w:tcPr>
+          <w:p>
+            <w:r>
+              <w:t>Logout</w:t>
+            </w:r>
+          </w:p>
+        </w:tc>
+        <w:tc>
+          <w:tcPr>
+            <w:tcW w:type="dxa" w:w="2880"/>
+          </w:tcPr>
+          <w:p>
+            <w:r>
+              <w:t>Customer, Bank operations</w:t>
+            </w:r>
+          </w:p>
+        </w:tc>
+      </w:tr>
+      <w:tr>
+        <w:tc>
+          <w:tcPr>
+            <w:tcW w:type="dxa" w:w="2880"/>
+          </w:tcPr>
+          <w:p>
+            <w:r>
+              <w:t>5</w:t>
+            </w:r>
+          </w:p>
+        </w:tc>
+        <w:tc>
+          <w:tcPr>
+            <w:tcW w:type="dxa" w:w="2880"/>
+          </w:tcPr>
+          <w:p>
+            <w:r>
+              <w:t>Money transfer</w:t>
+            </w:r>
+          </w:p>
+        </w:tc>
+        <w:tc>
+          <w:tcPr>
+            <w:tcW w:type="dxa" w:w="2880"/>
+          </w:tcPr>
+          <w:p>
+            <w:r>
+              <w:t>Customer</w:t>
+            </w:r>
+          </w:p>
+        </w:tc>
+      </w:tr>
+      <w:tr>
+        <w:tc>
+          <w:tcPr>
+            <w:tcW w:type="dxa" w:w="2880"/>
+          </w:tcPr>
+          <w:p>
+            <w:r>
+              <w:t>6</w:t>
+            </w:r>
+          </w:p>
+        </w:tc>
+        <w:tc>
+          <w:tcPr>
+            <w:tcW w:type="dxa" w:w="2880"/>
+          </w:tcPr>
+          <w:p>
+            <w:r>
+              <w:t>Money receive</w:t>
+            </w:r>
+          </w:p>
+        </w:tc>
+        <w:tc>
+          <w:tcPr>
+            <w:tcW w:type="dxa" w:w="2880"/>
+          </w:tcPr>
+          <w:p>
+            <w:r>
+              <w:t>Customer</w:t>
+            </w:r>
+          </w:p>
+        </w:tc>
+      </w:tr>
+      <w:tr>
+        <w:tc>
+          <w:tcPr>
+            <w:tcW w:type="dxa" w:w="2880"/>
+          </w:tcPr>
+          <w:p>
+            <w:r>
+              <w:t>7</w:t>
+            </w:r>
+          </w:p>
+        </w:tc>
+        <w:tc>
+          <w:tcPr>
+            <w:tcW w:type="dxa" w:w="2880"/>
+          </w:tcPr>
+          <w:p>
+            <w:r>
+              <w:t>Statement view</w:t>
+            </w:r>
+          </w:p>
+        </w:tc>
+        <w:tc>
+          <w:tcPr>
+            <w:tcW w:type="dxa" w:w="2880"/>
+          </w:tcPr>
+          <w:p>
+            <w:r>
+              <w:t>Customer, Bank operations</w:t>
+            </w:r>
+          </w:p>
+        </w:tc>
+      </w:tr>
+      <w:tr>
+        <w:tc>
+          <w:tcPr>
+            <w:tcW w:type="dxa" w:w="2880"/>
+          </w:tcPr>
+          <w:p>
+            <w:r>
+              <w:t>8</w:t>
+            </w:r>
+          </w:p>
+        </w:tc>
+        <w:tc>
+          <w:tcPr>
+            <w:tcW w:type="dxa" w:w="2880"/>
+          </w:tcPr>
+          <w:p>
+            <w:r>
+              <w:t>Statement download</w:t>
+            </w:r>
+          </w:p>
+        </w:tc>
+        <w:tc>
+          <w:tcPr>
+            <w:tcW w:type="dxa" w:w="2880"/>
+          </w:tcPr>
+          <w:p>
+            <w:r>
+              <w:t>Customer</w:t>
+            </w:r>
+          </w:p>
+        </w:tc>
+      </w:tr>
+    </w:tbl>
     <w:p>
       <w:pPr>
         <w:pStyle w:val="Heading3"/>
@@ -772,7 +1121,7 @@
           </w:tcPr>
           <w:p>
             <w:r>
-              <w:t>Not on build list</w:t>
+              <w:t>Not on the v1 build list</w:t>
             </w:r>
           </w:p>
         </w:tc>
@@ -794,7 +1143,7 @@
           </w:tcPr>
           <w:p>
             <w:r>
-              <w:t>Format check only, mocked</w:t>
+              <w:t>Format check only; verification against government or issuing-authority systems is mocked</w:t>
             </w:r>
           </w:p>
         </w:tc>
@@ -816,7 +1165,7 @@
           </w:tcPr>
           <w:p>
             <w:r>
-              <w:t>Synthetic only</w:t>
+              <w:t>Synthetic funds only for v1</w:t>
             </w:r>
           </w:p>
         </w:tc>
@@ -885,7 +1234,7 @@
           </w:tcPr>
           <w:p>
             <w:r>
-              <w:t>Registers, completes KYC, logs in, transfers money, views/downloads statements</w:t>
+              <w:t>Registers, completes KYC, logs in, transfers and receives money, views and downloads statements</w:t>
             </w:r>
           </w:p>
         </w:tc>
@@ -907,7 +1256,7 @@
           </w:tcPr>
           <w:p>
             <w:r>
-              <w:t>Reviews KYC, activates/freezes accounts, views audit trail; cannot transfer money</w:t>
+              <w:t>Reviews KYC, activates/freezes accounts, views the audit trail; cannot initiate transfers</w:t>
             </w:r>
           </w:p>
         </w:tc>
@@ -971,7 +1320,20 @@
               <w:rPr>
                 <w:b/>
               </w:rPr>
-              <w:t>Rationale</w:t>
+              <w:t>Type</w:t>
+            </w:r>
+          </w:p>
+        </w:tc>
+        <w:tc>
+          <w:tcPr>
+            <w:tcW w:type="dxa" w:w="1440"/>
+          </w:tcPr>
+          <w:p>
+            <w:r>
+              <w:rPr>
+                <w:b/>
+              </w:rPr>
+              <w:t>Priority</w:t>
             </w:r>
           </w:p>
         </w:tc>
@@ -997,20 +1359,7 @@
               <w:rPr>
                 <w:b/>
               </w:rPr>
-              <w:t>Priority</w:t>
-            </w:r>
-          </w:p>
-        </w:tc>
-        <w:tc>
-          <w:tcPr>
-            <w:tcW w:type="dxa" w:w="1440"/>
-          </w:tcPr>
-          <w:p>
-            <w:r>
-              <w:rPr>
-                <w:b/>
-              </w:rPr>
-              <w:t>Status</w:t>
+              <w:t>Source(s)</w:t>
             </w:r>
           </w:p>
         </w:tc>
@@ -1032,7 +1381,7 @@
           </w:tcPr>
           <w:p>
             <w:r>
-              <w:t>KYC verification (Aadhaar, PAN) is a format-only check; no real government verification is performed. All KYC data is mocked/synthetic.</w:t>
+              <w:t>A prospective customer must complete KYC by submitting Aadhaar and PAN identifiers before an account can be opened.</w:t>
             </w:r>
           </w:p>
         </w:tc>
@@ -1042,7 +1391,7 @@
           </w:tcPr>
           <w:p>
             <w:r>
-              <w:t>Real Aadhaar/PAN verification is out of scope for v1; only a format check is required.</w:t>
+              <w:t>requirement-generating</w:t>
             </w:r>
           </w:p>
         </w:tc>
@@ -1052,6 +1401,16 @@
           </w:tcPr>
           <w:p>
             <w:r>
+              <w:t>Must</w:t>
+            </w:r>
+          </w:p>
+        </w:tc>
+        <w:tc>
+          <w:tcPr>
+            <w:tcW w:type="dxa" w:w="1440"/>
+          </w:tcPr>
+          <w:p>
+            <w:r>
               <w:t>Customer, Bank operations</w:t>
             </w:r>
           </w:p>
@@ -1062,17 +1421,7 @@
           </w:tcPr>
           <w:p>
             <w:r>
-              <w:t>Must</w:t>
-            </w:r>
-          </w:p>
-        </w:tc>
-        <w:tc>
-          <w:tcPr>
-            <w:tcW w:type="dxa" w:w="1440"/>
-          </w:tcPr>
-          <w:p>
-            <w:r>
-              <w:t>Draft</w:t>
+              <w:t>SA-IS1</w:t>
             </w:r>
           </w:p>
         </w:tc>
@@ -1094,7 +1443,7 @@
           </w:tcPr>
           <w:p>
             <w:r>
-              <w:t>A Customer account must be reviewed and activated by a Bank operations user before it can be used.</w:t>
+              <w:t>Aadhaar and PAN values submitted during KYC must pass a format validation check before being accepted.</w:t>
             </w:r>
           </w:p>
         </w:tc>
@@ -1104,7 +1453,7 @@
           </w:tcPr>
           <w:p>
             <w:r>
-              <w:t>Account on-boarding and activation is in scope, and Bank operations' responsibility includes reviewing KYC and activating accounts.</w:t>
+              <w:t>requirement-generating</w:t>
             </w:r>
           </w:p>
         </w:tc>
@@ -1114,7 +1463,7 @@
           </w:tcPr>
           <w:p>
             <w:r>
-              <w:t>Bank operations</w:t>
+              <w:t>Must</w:t>
             </w:r>
           </w:p>
         </w:tc>
@@ -1124,7 +1473,7 @@
           </w:tcPr>
           <w:p>
             <w:r>
-              <w:t>Must</w:t>
+              <w:t>Customer</w:t>
             </w:r>
           </w:p>
         </w:tc>
@@ -1134,7 +1483,7 @@
           </w:tcPr>
           <w:p>
             <w:r>
-              <w:t>Draft</w:t>
+              <w:t>SA-OOS2</w:t>
             </w:r>
           </w:p>
         </w:tc>
@@ -1156,7 +1505,7 @@
           </w:tcPr>
           <w:p>
             <w:r>
-              <w:t>Bank operations may review KYC, activate or freeze accounts, and view the audit trail, but must not initiate money transfers.</w:t>
+              <w:t>Real-time verification of Aadhaar/PAN against government or issuing-authority systems is excluded from v1; verification is mocked.</w:t>
             </w:r>
           </w:p>
         </w:tc>
@@ -1166,7 +1515,7 @@
           </w:tcPr>
           <w:p>
             <w:r>
-              <w:t>The Roles section explicitly restricts Bank operations from transferring money.</w:t>
+              <w:t>exclusion</w:t>
             </w:r>
           </w:p>
         </w:tc>
@@ -1176,7 +1525,7 @@
           </w:tcPr>
           <w:p>
             <w:r>
-              <w:t>Bank operations</w:t>
+              <w:t>Must</w:t>
             </w:r>
           </w:p>
         </w:tc>
@@ -1186,7 +1535,7 @@
           </w:tcPr>
           <w:p>
             <w:r>
-              <w:t>Must</w:t>
+              <w:t>—</w:t>
             </w:r>
           </w:p>
         </w:tc>
@@ -1196,7 +1545,7 @@
           </w:tcPr>
           <w:p>
             <w:r>
-              <w:t>Draft</w:t>
+              <w:t>SA-OOS2</w:t>
             </w:r>
           </w:p>
         </w:tc>
@@ -1218,7 +1567,7 @@
           </w:tcPr>
           <w:p>
             <w:r>
-              <w:t>Only an authenticated Customer may initiate a money transfer or view/download their own statements.</w:t>
+              <w:t>A newly on-boarded account must pass through an activation step before it can be used for transactions.</w:t>
             </w:r>
           </w:p>
         </w:tc>
@@ -1228,7 +1577,7 @@
           </w:tcPr>
           <w:p>
             <w:r>
-              <w:t>Money transfer, statement view, and statement download are scoped to the Customer role.</w:t>
+              <w:t>requirement-generating</w:t>
             </w:r>
           </w:p>
         </w:tc>
@@ -1238,7 +1587,7 @@
           </w:tcPr>
           <w:p>
             <w:r>
-              <w:t>Customer</w:t>
+              <w:t>Must</w:t>
             </w:r>
           </w:p>
         </w:tc>
@@ -1248,7 +1597,7 @@
           </w:tcPr>
           <w:p>
             <w:r>
-              <w:t>Must</w:t>
+              <w:t>Customer, Bank operations</w:t>
             </w:r>
           </w:p>
         </w:tc>
@@ -1258,7 +1607,7 @@
           </w:tcPr>
           <w:p>
             <w:r>
-              <w:t>Draft</w:t>
+              <w:t>SA-IS2</w:t>
             </w:r>
           </w:p>
         </w:tc>
@@ -1280,7 +1629,7 @@
           </w:tcPr>
           <w:p>
             <w:r>
-              <w:t>All money movement in the simulation is synthetic; no real funds are transferred at any point.</w:t>
+              <w:t>Only authenticated users may access Customer or Bank operations functionality; login with valid credentials is required.</w:t>
             </w:r>
           </w:p>
         </w:tc>
@@ -1290,7 +1639,7 @@
           </w:tcPr>
           <w:p>
             <w:r>
-              <w:t>Real money movement is explicitly out of scope.</w:t>
+              <w:t>requirement-generating</w:t>
             </w:r>
           </w:p>
         </w:tc>
@@ -1300,6 +1649,16 @@
           </w:tcPr>
           <w:p>
             <w:r>
+              <w:t>Must</w:t>
+            </w:r>
+          </w:p>
+        </w:tc>
+        <w:tc>
+          <w:tcPr>
+            <w:tcW w:type="dxa" w:w="1440"/>
+          </w:tcPr>
+          <w:p>
+            <w:r>
               <w:t>Customer, Bank operations</w:t>
             </w:r>
           </w:p>
@@ -1310,17 +1669,7 @@
           </w:tcPr>
           <w:p>
             <w:r>
-              <w:t>Must</w:t>
-            </w:r>
-          </w:p>
-        </w:tc>
-        <w:tc>
-          <w:tcPr>
-            <w:tcW w:type="dxa" w:w="1440"/>
-          </w:tcPr>
-          <w:p>
-            <w:r>
-              <w:t>Draft</w:t>
+              <w:t>SA-IS3, SA-ROLE-CUST, SA-ROLE-BANKOPS</w:t>
             </w:r>
           </w:p>
         </w:tc>
@@ -1342,7 +1691,7 @@
           </w:tcPr>
           <w:p>
             <w:r>
-              <w:t>Beneficiary management, notifications, and service requests are excluded from the v1 build.</w:t>
+              <w:t>An authenticated user must be able to explicitly end their session via logout.</w:t>
             </w:r>
           </w:p>
         </w:tc>
@@ -1352,7 +1701,7 @@
           </w:tcPr>
           <w:p>
             <w:r>
-              <w:t>Explicitly listed as out of scope and not on the build list for v1.</w:t>
+              <w:t>requirement-generating</w:t>
             </w:r>
           </w:p>
         </w:tc>
@@ -1362,6 +1711,16 @@
           </w:tcPr>
           <w:p>
             <w:r>
+              <w:t>Must</w:t>
+            </w:r>
+          </w:p>
+        </w:tc>
+        <w:tc>
+          <w:tcPr>
+            <w:tcW w:type="dxa" w:w="1440"/>
+          </w:tcPr>
+          <w:p>
+            <w:r>
               <w:t>Customer, Bank operations</w:t>
             </w:r>
           </w:p>
@@ -1372,17 +1731,7 @@
           </w:tcPr>
           <w:p>
             <w:r>
-              <w:t>Must</w:t>
-            </w:r>
-          </w:p>
-        </w:tc>
-        <w:tc>
-          <w:tcPr>
-            <w:tcW w:type="dxa" w:w="1440"/>
-          </w:tcPr>
-          <w:p>
-            <w:r>
-              <w:t>Draft</w:t>
+              <w:t>SA-IS4</w:t>
             </w:r>
           </w:p>
         </w:tc>
@@ -1404,7 +1753,7 @@
           </w:tcPr>
           <w:p>
             <w:r>
-              <w:t>Every account and transaction state change (e.g. activation, freeze, transfer, login/logout) must be recorded and viewable by Bank operations as an audit trail.</w:t>
+              <w:t>Only the Customer role may initiate a money transfer from their own account; Bank operations is explicitly barred from initiating transfers.</w:t>
             </w:r>
           </w:p>
         </w:tc>
@@ -1414,7 +1763,7 @@
           </w:tcPr>
           <w:p>
             <w:r>
-              <w:t>The charter requires auditable state changes; Bank operations' role includes viewing the audit trail.</w:t>
+              <w:t>requirement-generating</w:t>
             </w:r>
           </w:p>
         </w:tc>
@@ -1424,7 +1773,7 @@
           </w:tcPr>
           <w:p>
             <w:r>
-              <w:t>Bank operations</w:t>
+              <w:t>Must</w:t>
             </w:r>
           </w:p>
         </w:tc>
@@ -1434,7 +1783,7 @@
           </w:tcPr>
           <w:p>
             <w:r>
-              <w:t>Should</w:t>
+              <w:t>Customer, Bank operations</w:t>
             </w:r>
           </w:p>
         </w:tc>
@@ -1444,7 +1793,7 @@
           </w:tcPr>
           <w:p>
             <w:r>
-              <w:t>Draft</w:t>
+              <w:t>SA-IS5, SA-ROLE-BANKOPS</w:t>
             </w:r>
           </w:p>
         </w:tc>
@@ -1466,7 +1815,7 @@
           </w:tcPr>
           <w:p>
             <w:r>
-              <w:t>A user session must require successful login authentication and must be terminated on logout.</w:t>
+              <w:t>All money movement in v1 is synthetic; no real funds are moved between real financial institutions or accounts.</w:t>
             </w:r>
           </w:p>
         </w:tc>
@@ -1476,7 +1825,7 @@
           </w:tcPr>
           <w:p>
             <w:r>
-              <w:t>Login and logout are in scope and are access-control preconditions for all other in-scope activities.</w:t>
+              <w:t>exclusion</w:t>
             </w:r>
           </w:p>
         </w:tc>
@@ -1486,6 +1835,140 @@
           </w:tcPr>
           <w:p>
             <w:r>
+              <w:t>Must</w:t>
+            </w:r>
+          </w:p>
+        </w:tc>
+        <w:tc>
+          <w:tcPr>
+            <w:tcW w:type="dxa" w:w="1440"/>
+          </w:tcPr>
+          <w:p>
+            <w:r>
+              <w:t>—</w:t>
+            </w:r>
+          </w:p>
+        </w:tc>
+        <w:tc>
+          <w:tcPr>
+            <w:tcW w:type="dxa" w:w="1440"/>
+          </w:tcPr>
+          <w:p>
+            <w:r>
+              <w:t>SA-OOS3</w:t>
+            </w:r>
+          </w:p>
+        </w:tc>
+      </w:tr>
+      <w:tr>
+        <w:tc>
+          <w:tcPr>
+            <w:tcW w:type="dxa" w:w="1440"/>
+          </w:tcPr>
+          <w:p>
+            <w:r>
+              <w:t>BR-009</w:t>
+            </w:r>
+          </w:p>
+        </w:tc>
+        <w:tc>
+          <w:tcPr>
+            <w:tcW w:type="dxa" w:w="1440"/>
+          </w:tcPr>
+          <w:p>
+            <w:r>
+              <w:t>A Customer account must be able to receive an incoming money transfer and reflect it as a credit to the account balance.</w:t>
+            </w:r>
+          </w:p>
+        </w:tc>
+        <w:tc>
+          <w:tcPr>
+            <w:tcW w:type="dxa" w:w="1440"/>
+          </w:tcPr>
+          <w:p>
+            <w:r>
+              <w:t>requirement-generating</w:t>
+            </w:r>
+          </w:p>
+        </w:tc>
+        <w:tc>
+          <w:tcPr>
+            <w:tcW w:type="dxa" w:w="1440"/>
+          </w:tcPr>
+          <w:p>
+            <w:r>
+              <w:t>Must</w:t>
+            </w:r>
+          </w:p>
+        </w:tc>
+        <w:tc>
+          <w:tcPr>
+            <w:tcW w:type="dxa" w:w="1440"/>
+          </w:tcPr>
+          <w:p>
+            <w:r>
+              <w:t>Customer</w:t>
+            </w:r>
+          </w:p>
+        </w:tc>
+        <w:tc>
+          <w:tcPr>
+            <w:tcW w:type="dxa" w:w="1440"/>
+          </w:tcPr>
+          <w:p>
+            <w:r>
+              <w:t>SA-IS6</w:t>
+            </w:r>
+          </w:p>
+        </w:tc>
+      </w:tr>
+      <w:tr>
+        <w:tc>
+          <w:tcPr>
+            <w:tcW w:type="dxa" w:w="1440"/>
+          </w:tcPr>
+          <w:p>
+            <w:r>
+              <w:t>BR-010</w:t>
+            </w:r>
+          </w:p>
+        </w:tc>
+        <w:tc>
+          <w:tcPr>
+            <w:tcW w:type="dxa" w:w="1440"/>
+          </w:tcPr>
+          <w:p>
+            <w:r>
+              <w:t>Both Customer and Bank operations roles may view an account statement.</w:t>
+            </w:r>
+          </w:p>
+        </w:tc>
+        <w:tc>
+          <w:tcPr>
+            <w:tcW w:type="dxa" w:w="1440"/>
+          </w:tcPr>
+          <w:p>
+            <w:r>
+              <w:t>requirement-generating</w:t>
+            </w:r>
+          </w:p>
+        </w:tc>
+        <w:tc>
+          <w:tcPr>
+            <w:tcW w:type="dxa" w:w="1440"/>
+          </w:tcPr>
+          <w:p>
+            <w:r>
+              <w:t>Must</w:t>
+            </w:r>
+          </w:p>
+        </w:tc>
+        <w:tc>
+          <w:tcPr>
+            <w:tcW w:type="dxa" w:w="1440"/>
+          </w:tcPr>
+          <w:p>
+            <w:r>
               <w:t>Customer, Bank operations</w:t>
             </w:r>
           </w:p>
@@ -1496,6 +1979,110 @@
           </w:tcPr>
           <w:p>
             <w:r>
+              <w:t>SA-IS7, SA-ROLE-CUST, SA-ROLE-BANKOPS</w:t>
+            </w:r>
+          </w:p>
+        </w:tc>
+      </w:tr>
+      <w:tr>
+        <w:tc>
+          <w:tcPr>
+            <w:tcW w:type="dxa" w:w="1440"/>
+          </w:tcPr>
+          <w:p>
+            <w:r>
+              <w:t>BR-011</w:t>
+            </w:r>
+          </w:p>
+        </w:tc>
+        <w:tc>
+          <w:tcPr>
+            <w:tcW w:type="dxa" w:w="1440"/>
+          </w:tcPr>
+          <w:p>
+            <w:r>
+              <w:t>The Customer role may download their account statement as a file.</w:t>
+            </w:r>
+          </w:p>
+        </w:tc>
+        <w:tc>
+          <w:tcPr>
+            <w:tcW w:type="dxa" w:w="1440"/>
+          </w:tcPr>
+          <w:p>
+            <w:r>
+              <w:t>requirement-generating</w:t>
+            </w:r>
+          </w:p>
+        </w:tc>
+        <w:tc>
+          <w:tcPr>
+            <w:tcW w:type="dxa" w:w="1440"/>
+          </w:tcPr>
+          <w:p>
+            <w:r>
+              <w:t>Should</w:t>
+            </w:r>
+          </w:p>
+        </w:tc>
+        <w:tc>
+          <w:tcPr>
+            <w:tcW w:type="dxa" w:w="1440"/>
+          </w:tcPr>
+          <w:p>
+            <w:r>
+              <w:t>Customer</w:t>
+            </w:r>
+          </w:p>
+        </w:tc>
+        <w:tc>
+          <w:tcPr>
+            <w:tcW w:type="dxa" w:w="1440"/>
+          </w:tcPr>
+          <w:p>
+            <w:r>
+              <w:t>SA-IS8, SA-ROLE-CUST</w:t>
+            </w:r>
+          </w:p>
+        </w:tc>
+      </w:tr>
+      <w:tr>
+        <w:tc>
+          <w:tcPr>
+            <w:tcW w:type="dxa" w:w="1440"/>
+          </w:tcPr>
+          <w:p>
+            <w:r>
+              <w:t>BR-012</w:t>
+            </w:r>
+          </w:p>
+        </w:tc>
+        <w:tc>
+          <w:tcPr>
+            <w:tcW w:type="dxa" w:w="1440"/>
+          </w:tcPr>
+          <w:p>
+            <w:r>
+              <w:t>Bank operations must be able to review a submitted KYC application and approve or reject it.</w:t>
+            </w:r>
+          </w:p>
+        </w:tc>
+        <w:tc>
+          <w:tcPr>
+            <w:tcW w:type="dxa" w:w="1440"/>
+          </w:tcPr>
+          <w:p>
+            <w:r>
+              <w:t>requirement-generating</w:t>
+            </w:r>
+          </w:p>
+        </w:tc>
+        <w:tc>
+          <w:tcPr>
+            <w:tcW w:type="dxa" w:w="1440"/>
+          </w:tcPr>
+          <w:p>
+            <w:r>
               <w:t>Must</w:t>
             </w:r>
           </w:p>
@@ -1506,12 +2093,532 @@
           </w:tcPr>
           <w:p>
             <w:r>
-              <w:t>Draft</w:t>
+              <w:t>Bank operations</w:t>
+            </w:r>
+          </w:p>
+        </w:tc>
+        <w:tc>
+          <w:tcPr>
+            <w:tcW w:type="dxa" w:w="1440"/>
+          </w:tcPr>
+          <w:p>
+            <w:r>
+              <w:t>SA-ROLE-BANKOPS, SA-IS1</w:t>
+            </w:r>
+          </w:p>
+        </w:tc>
+      </w:tr>
+      <w:tr>
+        <w:tc>
+          <w:tcPr>
+            <w:tcW w:type="dxa" w:w="1440"/>
+          </w:tcPr>
+          <w:p>
+            <w:r>
+              <w:t>BR-013</w:t>
+            </w:r>
+          </w:p>
+        </w:tc>
+        <w:tc>
+          <w:tcPr>
+            <w:tcW w:type="dxa" w:w="1440"/>
+          </w:tcPr>
+          <w:p>
+            <w:r>
+              <w:t>Bank operations must be able to activate or freeze a Customer account.</w:t>
+            </w:r>
+          </w:p>
+        </w:tc>
+        <w:tc>
+          <w:tcPr>
+            <w:tcW w:type="dxa" w:w="1440"/>
+          </w:tcPr>
+          <w:p>
+            <w:r>
+              <w:t>requirement-generating</w:t>
+            </w:r>
+          </w:p>
+        </w:tc>
+        <w:tc>
+          <w:tcPr>
+            <w:tcW w:type="dxa" w:w="1440"/>
+          </w:tcPr>
+          <w:p>
+            <w:r>
+              <w:t>Must</w:t>
+            </w:r>
+          </w:p>
+        </w:tc>
+        <w:tc>
+          <w:tcPr>
+            <w:tcW w:type="dxa" w:w="1440"/>
+          </w:tcPr>
+          <w:p>
+            <w:r>
+              <w:t>Bank operations</w:t>
+            </w:r>
+          </w:p>
+        </w:tc>
+        <w:tc>
+          <w:tcPr>
+            <w:tcW w:type="dxa" w:w="1440"/>
+          </w:tcPr>
+          <w:p>
+            <w:r>
+              <w:t>SA-ROLE-BANKOPS, SA-IS2</w:t>
+            </w:r>
+          </w:p>
+        </w:tc>
+      </w:tr>
+      <w:tr>
+        <w:tc>
+          <w:tcPr>
+            <w:tcW w:type="dxa" w:w="1440"/>
+          </w:tcPr>
+          <w:p>
+            <w:r>
+              <w:t>BR-014</w:t>
+            </w:r>
+          </w:p>
+        </w:tc>
+        <w:tc>
+          <w:tcPr>
+            <w:tcW w:type="dxa" w:w="1440"/>
+          </w:tcPr>
+          <w:p>
+            <w:r>
+              <w:t>Bank operations must have access to an audit trail of account and transaction state changes.</w:t>
+            </w:r>
+          </w:p>
+        </w:tc>
+        <w:tc>
+          <w:tcPr>
+            <w:tcW w:type="dxa" w:w="1440"/>
+          </w:tcPr>
+          <w:p>
+            <w:r>
+              <w:t>requirement-generating</w:t>
+            </w:r>
+          </w:p>
+        </w:tc>
+        <w:tc>
+          <w:tcPr>
+            <w:tcW w:type="dxa" w:w="1440"/>
+          </w:tcPr>
+          <w:p>
+            <w:r>
+              <w:t>Must</w:t>
+            </w:r>
+          </w:p>
+        </w:tc>
+        <w:tc>
+          <w:tcPr>
+            <w:tcW w:type="dxa" w:w="1440"/>
+          </w:tcPr>
+          <w:p>
+            <w:r>
+              <w:t>Bank operations</w:t>
+            </w:r>
+          </w:p>
+        </w:tc>
+        <w:tc>
+          <w:tcPr>
+            <w:tcW w:type="dxa" w:w="1440"/>
+          </w:tcPr>
+          <w:p>
+            <w:r>
+              <w:t>SA-ROLE-BANKOPS, CH-OBJ2</w:t>
+            </w:r>
+          </w:p>
+        </w:tc>
+      </w:tr>
+      <w:tr>
+        <w:tc>
+          <w:tcPr>
+            <w:tcW w:type="dxa" w:w="1440"/>
+          </w:tcPr>
+          <w:p>
+            <w:r>
+              <w:t>BR-015</w:t>
+            </w:r>
+          </w:p>
+        </w:tc>
+        <w:tc>
+          <w:tcPr>
+            <w:tcW w:type="dxa" w:w="1440"/>
+          </w:tcPr>
+          <w:p>
+            <w:r>
+              <w:t>Beneficiary management (adding, editing, or removing payees) is excluded from v1 and will not be built.</w:t>
+            </w:r>
+          </w:p>
+        </w:tc>
+        <w:tc>
+          <w:tcPr>
+            <w:tcW w:type="dxa" w:w="1440"/>
+          </w:tcPr>
+          <w:p>
+            <w:r>
+              <w:t>exclusion</w:t>
+            </w:r>
+          </w:p>
+        </w:tc>
+        <w:tc>
+          <w:tcPr>
+            <w:tcW w:type="dxa" w:w="1440"/>
+          </w:tcPr>
+          <w:p>
+            <w:r>
+              <w:t>Must</w:t>
+            </w:r>
+          </w:p>
+        </w:tc>
+        <w:tc>
+          <w:tcPr>
+            <w:tcW w:type="dxa" w:w="1440"/>
+          </w:tcPr>
+          <w:p>
+            <w:r>
+              <w:t>—</w:t>
+            </w:r>
+          </w:p>
+        </w:tc>
+        <w:tc>
+          <w:tcPr>
+            <w:tcW w:type="dxa" w:w="1440"/>
+          </w:tcPr>
+          <w:p>
+            <w:r>
+              <w:t>SA-OOS1</w:t>
+            </w:r>
+          </w:p>
+        </w:tc>
+      </w:tr>
+      <w:tr>
+        <w:tc>
+          <w:tcPr>
+            <w:tcW w:type="dxa" w:w="1440"/>
+          </w:tcPr>
+          <w:p>
+            <w:r>
+              <w:t>BR-016</w:t>
+            </w:r>
+          </w:p>
+        </w:tc>
+        <w:tc>
+          <w:tcPr>
+            <w:tcW w:type="dxa" w:w="1440"/>
+          </w:tcPr>
+          <w:p>
+            <w:r>
+              <w:t>Notifications (e.g., transaction or account alerts) are excluded from v1 and will not be built.</w:t>
+            </w:r>
+          </w:p>
+        </w:tc>
+        <w:tc>
+          <w:tcPr>
+            <w:tcW w:type="dxa" w:w="1440"/>
+          </w:tcPr>
+          <w:p>
+            <w:r>
+              <w:t>exclusion</w:t>
+            </w:r>
+          </w:p>
+        </w:tc>
+        <w:tc>
+          <w:tcPr>
+            <w:tcW w:type="dxa" w:w="1440"/>
+          </w:tcPr>
+          <w:p>
+            <w:r>
+              <w:t>Must</w:t>
+            </w:r>
+          </w:p>
+        </w:tc>
+        <w:tc>
+          <w:tcPr>
+            <w:tcW w:type="dxa" w:w="1440"/>
+          </w:tcPr>
+          <w:p>
+            <w:r>
+              <w:t>—</w:t>
+            </w:r>
+          </w:p>
+        </w:tc>
+        <w:tc>
+          <w:tcPr>
+            <w:tcW w:type="dxa" w:w="1440"/>
+          </w:tcPr>
+          <w:p>
+            <w:r>
+              <w:t>SA-OOS1</w:t>
+            </w:r>
+          </w:p>
+        </w:tc>
+      </w:tr>
+      <w:tr>
+        <w:tc>
+          <w:tcPr>
+            <w:tcW w:type="dxa" w:w="1440"/>
+          </w:tcPr>
+          <w:p>
+            <w:r>
+              <w:t>BR-017</w:t>
+            </w:r>
+          </w:p>
+        </w:tc>
+        <w:tc>
+          <w:tcPr>
+            <w:tcW w:type="dxa" w:w="1440"/>
+          </w:tcPr>
+          <w:p>
+            <w:r>
+              <w:t>Service requests (e.g., customer support ticketing) are excluded from v1 and will not be built.</w:t>
+            </w:r>
+          </w:p>
+        </w:tc>
+        <w:tc>
+          <w:tcPr>
+            <w:tcW w:type="dxa" w:w="1440"/>
+          </w:tcPr>
+          <w:p>
+            <w:r>
+              <w:t>exclusion</w:t>
+            </w:r>
+          </w:p>
+        </w:tc>
+        <w:tc>
+          <w:tcPr>
+            <w:tcW w:type="dxa" w:w="1440"/>
+          </w:tcPr>
+          <w:p>
+            <w:r>
+              <w:t>Must</w:t>
+            </w:r>
+          </w:p>
+        </w:tc>
+        <w:tc>
+          <w:tcPr>
+            <w:tcW w:type="dxa" w:w="1440"/>
+          </w:tcPr>
+          <w:p>
+            <w:r>
+              <w:t>—</w:t>
+            </w:r>
+          </w:p>
+        </w:tc>
+        <w:tc>
+          <w:tcPr>
+            <w:tcW w:type="dxa" w:w="1440"/>
+          </w:tcPr>
+          <w:p>
+            <w:r>
+              <w:t>SA-OOS1</w:t>
+            </w:r>
+          </w:p>
+        </w:tc>
+      </w:tr>
+      <w:tr>
+        <w:tc>
+          <w:tcPr>
+            <w:tcW w:type="dxa" w:w="1440"/>
+          </w:tcPr>
+          <w:p>
+            <w:r>
+              <w:t>BR-018</w:t>
+            </w:r>
+          </w:p>
+        </w:tc>
+        <w:tc>
+          <w:tcPr>
+            <w:tcW w:type="dxa" w:w="1440"/>
+          </w:tcPr>
+          <w:p>
+            <w:r>
+              <w:t>Every state-changing action on an account or transaction must be recorded in a way that supports an auditable history.</w:t>
+            </w:r>
+          </w:p>
+        </w:tc>
+        <w:tc>
+          <w:tcPr>
+            <w:tcW w:type="dxa" w:w="1440"/>
+          </w:tcPr>
+          <w:p>
+            <w:r>
+              <w:t>requirement-generating</w:t>
+            </w:r>
+          </w:p>
+        </w:tc>
+        <w:tc>
+          <w:tcPr>
+            <w:tcW w:type="dxa" w:w="1440"/>
+          </w:tcPr>
+          <w:p>
+            <w:r>
+              <w:t>Must</w:t>
+            </w:r>
+          </w:p>
+        </w:tc>
+        <w:tc>
+          <w:tcPr>
+            <w:tcW w:type="dxa" w:w="1440"/>
+          </w:tcPr>
+          <w:p>
+            <w:r>
+              <w:t>Customer, Bank operations</w:t>
+            </w:r>
+          </w:p>
+        </w:tc>
+        <w:tc>
+          <w:tcPr>
+            <w:tcW w:type="dxa" w:w="1440"/>
+          </w:tcPr>
+          <w:p>
+            <w:r>
+              <w:t>CH-OBJ2</w:t>
+            </w:r>
+          </w:p>
+        </w:tc>
+      </w:tr>
+      <w:tr>
+        <w:tc>
+          <w:tcPr>
+            <w:tcW w:type="dxa" w:w="1440"/>
+          </w:tcPr>
+          <w:p>
+            <w:r>
+              <w:t>BR-019</w:t>
+            </w:r>
+          </w:p>
+        </w:tc>
+        <w:tc>
+          <w:tcPr>
+            <w:tcW w:type="dxa" w:w="1440"/>
+          </w:tcPr>
+          <w:p>
+            <w:r>
+              <w:t>Agent-produced pipeline artifacts (BRD, designs, code, tests, defect analyses) must be reviewable, reproducible, schema-valid, and source-linked, and remain subject to human approval before being treated as approved.</w:t>
+            </w:r>
+          </w:p>
+        </w:tc>
+        <w:tc>
+          <w:tcPr>
+            <w:tcW w:type="dxa" w:w="1440"/>
+          </w:tcPr>
+          <w:p>
+            <w:r>
+              <w:t>requirement-generating</w:t>
+            </w:r>
+          </w:p>
+        </w:tc>
+        <w:tc>
+          <w:tcPr>
+            <w:tcW w:type="dxa" w:w="1440"/>
+          </w:tcPr>
+          <w:p>
+            <w:r>
+              <w:t>Must</w:t>
+            </w:r>
+          </w:p>
+        </w:tc>
+        <w:tc>
+          <w:tcPr>
+            <w:tcW w:type="dxa" w:w="1440"/>
+          </w:tcPr>
+          <w:p>
+            <w:r>
+              <w:t>—</w:t>
+            </w:r>
+          </w:p>
+        </w:tc>
+        <w:tc>
+          <w:tcPr>
+            <w:tcW w:type="dxa" w:w="1440"/>
+          </w:tcPr>
+          <w:p>
+            <w:r>
+              <w:t>CH-OBJ4</w:t>
+            </w:r>
+          </w:p>
+        </w:tc>
+      </w:tr>
+      <w:tr>
+        <w:tc>
+          <w:tcPr>
+            <w:tcW w:type="dxa" w:w="1440"/>
+          </w:tcPr>
+          <w:p>
+            <w:r>
+              <w:t>BR-020</w:t>
+            </w:r>
+          </w:p>
+        </w:tc>
+        <w:tc>
+          <w:tcPr>
+            <w:tcW w:type="dxa" w:w="1440"/>
+          </w:tcPr>
+          <w:p>
+            <w:r>
+              <w:t>Security, privacy, accessibility, reliability, and testability are mandatory acceptance conditions for every in-scope feature, not optional enhancements.</w:t>
+            </w:r>
+          </w:p>
+        </w:tc>
+        <w:tc>
+          <w:tcPr>
+            <w:tcW w:type="dxa" w:w="1440"/>
+          </w:tcPr>
+          <w:p>
+            <w:r>
+              <w:t>requirement-generating</w:t>
+            </w:r>
+          </w:p>
+        </w:tc>
+        <w:tc>
+          <w:tcPr>
+            <w:tcW w:type="dxa" w:w="1440"/>
+          </w:tcPr>
+          <w:p>
+            <w:r>
+              <w:t>Must</w:t>
+            </w:r>
+          </w:p>
+        </w:tc>
+        <w:tc>
+          <w:tcPr>
+            <w:tcW w:type="dxa" w:w="1440"/>
+          </w:tcPr>
+          <w:p>
+            <w:r>
+              <w:t>Customer, Bank operations</w:t>
+            </w:r>
+          </w:p>
+        </w:tc>
+        <w:tc>
+          <w:tcPr>
+            <w:tcW w:type="dxa" w:w="1440"/>
+          </w:tcPr>
+          <w:p>
+            <w:r>
+              <w:t>CH-OBJ5</w:t>
             </w:r>
           </w:p>
         </w:tc>
       </w:tr>
     </w:tbl>
+    <w:p>
+      <w:r>
+        <w:t xml:space="preserve">All rules are </w:t>
+      </w:r>
+      <w:r>
+        <w:rPr>
+          <w:b/>
+        </w:rPr>
+        <w:t>status: Draft</w:t>
+      </w:r>
+      <w:r>
+        <w:t>, pending human approval.</w:t>
+      </w:r>
+    </w:p>
     <w:p>
       <w:pPr>
         <w:pStyle w:val="Heading2"/>
@@ -1530,7 +2637,7 @@
     </w:p>
     <w:p>
       <w:r>
-        <w:t>Requirements are organized as Functional (F#) and Non-Functional (NF#), each tracing to one or more business rules (BR-xxx) and/or scope agreement items via source IDs.</w:t>
+        <w:t>Requirements are organized as Functional (F1, F2, ...) and Non-Functional (NF1, NF2, ...), each tracing to one or more Business Rules in Section 6 via `source_ids`, which in turn trace to charter.md or scope_agreement.md items (Section 1.3 References).</w:t>
       </w:r>
     </w:p>
     <w:p>
@@ -1637,7 +2744,7 @@
           </w:tcPr>
           <w:p>
             <w:r>
-              <w:t>The system shall allow a Customer to register and submit KYC details (Aadhaar, PAN) as part of onboarding.</w:t>
+              <w:t>The system shall allow a prospective customer to submit registration details including Aadhaar and PAN identifiers.</w:t>
             </w:r>
           </w:p>
         </w:tc>
@@ -1647,7 +2754,7 @@
           </w:tcPr>
           <w:p>
             <w:r>
-              <w:t>1</w:t>
+              <w:t>1 (Must)</w:t>
             </w:r>
           </w:p>
         </w:tc>
@@ -1657,7 +2764,7 @@
           </w:tcPr>
           <w:p>
             <w:r>
-              <w:t>SA-IN-1, BR-001</w:t>
+              <w:t>BR-001, BR-002</w:t>
             </w:r>
           </w:p>
         </w:tc>
@@ -1679,7 +2786,7 @@
           </w:tcPr>
           <w:p>
             <w:r>
-              <w:t>The system shall perform a format-only validation of submitted Aadhaar and PAN numbers; no real government verification is performed.</w:t>
+              <w:t>The system shall validate Aadhaar and PAN inputs against defined format rules and reject malformed values.</w:t>
             </w:r>
           </w:p>
         </w:tc>
@@ -1689,7 +2796,7 @@
           </w:tcPr>
           <w:p>
             <w:r>
-              <w:t>1</w:t>
+              <w:t>1 (Must)</w:t>
             </w:r>
           </w:p>
         </w:tc>
@@ -1699,7 +2806,7 @@
           </w:tcPr>
           <w:p>
             <w:r>
-              <w:t>SA-IN-1, SA-OUT-2, BR-001</w:t>
+              <w:t>BR-002</w:t>
             </w:r>
           </w:p>
         </w:tc>
@@ -1721,7 +2828,7 @@
           </w:tcPr>
           <w:p>
             <w:r>
-              <w:t>The system shall allow a Bank operations user to review a Customer's submitted KYC and activate the associated account.</w:t>
+              <w:t>The system shall route a submitted KYC application to Bank operations for review.</w:t>
             </w:r>
           </w:p>
         </w:tc>
@@ -1731,7 +2838,7 @@
           </w:tcPr>
           <w:p>
             <w:r>
-              <w:t>1</w:t>
+              <w:t>1 (Must)</w:t>
             </w:r>
           </w:p>
         </w:tc>
@@ -1741,7 +2848,7 @@
           </w:tcPr>
           <w:p>
             <w:r>
-              <w:t>SA-IN-2, SA-ROLE-OPS, BR-002</w:t>
+              <w:t>BR-001, BR-012</w:t>
             </w:r>
           </w:p>
         </w:tc>
@@ -1763,7 +2870,7 @@
           </w:tcPr>
           <w:p>
             <w:r>
-              <w:t>The system shall allow a Bank operations user to freeze an activated account.</w:t>
+              <w:t>Bank operations shall be able to approve or reject a KYC submission.</w:t>
             </w:r>
           </w:p>
         </w:tc>
@@ -1773,7 +2880,7 @@
           </w:tcPr>
           <w:p>
             <w:r>
-              <w:t>1</w:t>
+              <w:t>1 (Must)</w:t>
             </w:r>
           </w:p>
         </w:tc>
@@ -1783,7 +2890,7 @@
           </w:tcPr>
           <w:p>
             <w:r>
-              <w:t>SA-ROLE-OPS, BR-003</w:t>
+              <w:t>BR-012</w:t>
             </w:r>
           </w:p>
         </w:tc>
@@ -1805,7 +2912,7 @@
           </w:tcPr>
           <w:p>
             <w:r>
-              <w:t>The system shall allow Customer and Bank operations users to log in with valid credentials.</w:t>
+              <w:t>The system shall create an account record upon KYC approval, in a pending (not yet active) state.</w:t>
             </w:r>
           </w:p>
         </w:tc>
@@ -1815,7 +2922,7 @@
           </w:tcPr>
           <w:p>
             <w:r>
-              <w:t>1</w:t>
+              <w:t>1 (Must)</w:t>
             </w:r>
           </w:p>
         </w:tc>
@@ -1825,7 +2932,7 @@
           </w:tcPr>
           <w:p>
             <w:r>
-              <w:t>SA-IN-3, BR-008</w:t>
+              <w:t>BR-001, BR-004</w:t>
             </w:r>
           </w:p>
         </w:tc>
@@ -1847,7 +2954,7 @@
           </w:tcPr>
           <w:p>
             <w:r>
-              <w:t>The system shall allow Customer and Bank operations users to log out, terminating their active session.</w:t>
+              <w:t>Bank operations shall be able to activate a pending account.</w:t>
             </w:r>
           </w:p>
         </w:tc>
@@ -1857,7 +2964,7 @@
           </w:tcPr>
           <w:p>
             <w:r>
-              <w:t>1</w:t>
+              <w:t>1 (Must)</w:t>
             </w:r>
           </w:p>
         </w:tc>
@@ -1867,7 +2974,7 @@
           </w:tcPr>
           <w:p>
             <w:r>
-              <w:t>SA-IN-4, BR-008</w:t>
+              <w:t>BR-004, BR-013</w:t>
             </w:r>
           </w:p>
         </w:tc>
@@ -1889,7 +2996,7 @@
           </w:tcPr>
           <w:p>
             <w:r>
-              <w:t>The system shall allow an authenticated Customer to initiate a synthetic money transfer from their account.</w:t>
+              <w:t>Bank operations shall be able to freeze an active account.</w:t>
             </w:r>
           </w:p>
         </w:tc>
@@ -1899,7 +3006,7 @@
           </w:tcPr>
           <w:p>
             <w:r>
-              <w:t>1</w:t>
+              <w:t>2 (Should)</w:t>
             </w:r>
           </w:p>
         </w:tc>
@@ -1909,7 +3016,7 @@
           </w:tcPr>
           <w:p>
             <w:r>
-              <w:t>SA-IN-5, BR-004, BR-005</w:t>
+              <w:t>BR-013</w:t>
             </w:r>
           </w:p>
         </w:tc>
@@ -1931,7 +3038,7 @@
           </w:tcPr>
           <w:p>
             <w:r>
-              <w:t>The system shall allow an authenticated Customer's account to receive a synthetic money transfer.</w:t>
+              <w:t>The system shall allow Customer and Bank operations users to log in with valid credentials.</w:t>
             </w:r>
           </w:p>
         </w:tc>
@@ -1941,7 +3048,7 @@
           </w:tcPr>
           <w:p>
             <w:r>
-              <w:t>1</w:t>
+              <w:t>1 (Must)</w:t>
             </w:r>
           </w:p>
         </w:tc>
@@ -1951,7 +3058,7 @@
           </w:tcPr>
           <w:p>
             <w:r>
-              <w:t>SA-IN-6, BR-005</w:t>
+              <w:t>BR-005</w:t>
             </w:r>
           </w:p>
         </w:tc>
@@ -1973,7 +3080,7 @@
           </w:tcPr>
           <w:p>
             <w:r>
-              <w:t>The system shall allow Customer and Bank operations users to view account statements.</w:t>
+              <w:t>The system shall reject login attempts with invalid credentials.</w:t>
             </w:r>
           </w:p>
         </w:tc>
@@ -1983,7 +3090,7 @@
           </w:tcPr>
           <w:p>
             <w:r>
-              <w:t>1</w:t>
+              <w:t>1 (Must)</w:t>
             </w:r>
           </w:p>
         </w:tc>
@@ -1993,7 +3100,7 @@
           </w:tcPr>
           <w:p>
             <w:r>
-              <w:t>SA-IN-7</w:t>
+              <w:t>BR-005</w:t>
             </w:r>
           </w:p>
         </w:tc>
@@ -2015,7 +3122,7 @@
           </w:tcPr>
           <w:p>
             <w:r>
-              <w:t>The system shall allow a Customer to download their account statement.</w:t>
+              <w:t>The system shall allow an authenticated user to log out, terminating the session.</w:t>
             </w:r>
           </w:p>
         </w:tc>
@@ -2025,7 +3132,7 @@
           </w:tcPr>
           <w:p>
             <w:r>
-              <w:t>1</w:t>
+              <w:t>1 (Must)</w:t>
             </w:r>
           </w:p>
         </w:tc>
@@ -2035,7 +3142,7 @@
           </w:tcPr>
           <w:p>
             <w:r>
-              <w:t>SA-IN-8, BR-004</w:t>
+              <w:t>BR-006</w:t>
             </w:r>
           </w:p>
         </w:tc>
@@ -2057,7 +3164,7 @@
           </w:tcPr>
           <w:p>
             <w:r>
-              <w:t>The system shall allow a Bank operations user to view an audit trail of account and transaction state changes.</w:t>
+              <w:t>The system shall allow an authenticated Customer to initiate a money transfer from their own account to another account.</w:t>
             </w:r>
           </w:p>
         </w:tc>
@@ -2067,7 +3174,7 @@
           </w:tcPr>
           <w:p>
             <w:r>
-              <w:t>2</w:t>
+              <w:t>1 (Must)</w:t>
             </w:r>
           </w:p>
         </w:tc>
@@ -2077,7 +3184,7 @@
           </w:tcPr>
           <w:p>
             <w:r>
-              <w:t>SA-ROLE-OPS, BR-007, CH-OBJ-2</w:t>
+              <w:t>BR-007</w:t>
             </w:r>
           </w:p>
         </w:tc>
@@ -2109,7 +3216,7 @@
           </w:tcPr>
           <w:p>
             <w:r>
-              <w:t>1</w:t>
+              <w:t>1 (Must)</w:t>
             </w:r>
           </w:p>
         </w:tc>
@@ -2119,7 +3226,217 @@
           </w:tcPr>
           <w:p>
             <w:r>
-              <w:t>SA-ROLE-OPS, BR-003</w:t>
+              <w:t>BR-007</w:t>
+            </w:r>
+          </w:p>
+        </w:tc>
+      </w:tr>
+      <w:tr>
+        <w:tc>
+          <w:tcPr>
+            <w:tcW w:type="dxa" w:w="2160"/>
+          </w:tcPr>
+          <w:p>
+            <w:r>
+              <w:t>F13</w:t>
+            </w:r>
+          </w:p>
+        </w:tc>
+        <w:tc>
+          <w:tcPr>
+            <w:tcW w:type="dxa" w:w="2160"/>
+          </w:tcPr>
+          <w:p>
+            <w:r>
+              <w:t>The system shall debit the sender's synthetic balance and credit the recipient's synthetic balance upon a successful transfer.</w:t>
+            </w:r>
+          </w:p>
+        </w:tc>
+        <w:tc>
+          <w:tcPr>
+            <w:tcW w:type="dxa" w:w="2160"/>
+          </w:tcPr>
+          <w:p>
+            <w:r>
+              <w:t>1 (Must)</w:t>
+            </w:r>
+          </w:p>
+        </w:tc>
+        <w:tc>
+          <w:tcPr>
+            <w:tcW w:type="dxa" w:w="2160"/>
+          </w:tcPr>
+          <w:p>
+            <w:r>
+              <w:t>BR-007, BR-008, BR-009</w:t>
+            </w:r>
+          </w:p>
+        </w:tc>
+      </w:tr>
+      <w:tr>
+        <w:tc>
+          <w:tcPr>
+            <w:tcW w:type="dxa" w:w="2160"/>
+          </w:tcPr>
+          <w:p>
+            <w:r>
+              <w:t>F14</w:t>
+            </w:r>
+          </w:p>
+        </w:tc>
+        <w:tc>
+          <w:tcPr>
+            <w:tcW w:type="dxa" w:w="2160"/>
+          </w:tcPr>
+          <w:p>
+            <w:r>
+              <w:t>The system shall record a transaction entry for every transfer, visible to both the sending and receiving Customer.</w:t>
+            </w:r>
+          </w:p>
+        </w:tc>
+        <w:tc>
+          <w:tcPr>
+            <w:tcW w:type="dxa" w:w="2160"/>
+          </w:tcPr>
+          <w:p>
+            <w:r>
+              <w:t>1 (Must)</w:t>
+            </w:r>
+          </w:p>
+        </w:tc>
+        <w:tc>
+          <w:tcPr>
+            <w:tcW w:type="dxa" w:w="2160"/>
+          </w:tcPr>
+          <w:p>
+            <w:r>
+              <w:t>BR-009, BR-018</w:t>
+            </w:r>
+          </w:p>
+        </w:tc>
+      </w:tr>
+      <w:tr>
+        <w:tc>
+          <w:tcPr>
+            <w:tcW w:type="dxa" w:w="2160"/>
+          </w:tcPr>
+          <w:p>
+            <w:r>
+              <w:t>F15</w:t>
+            </w:r>
+          </w:p>
+        </w:tc>
+        <w:tc>
+          <w:tcPr>
+            <w:tcW w:type="dxa" w:w="2160"/>
+          </w:tcPr>
+          <w:p>
+            <w:r>
+              <w:t>The system shall allow Customer and Bank operations users to view an account statement for a selected account and period.</w:t>
+            </w:r>
+          </w:p>
+        </w:tc>
+        <w:tc>
+          <w:tcPr>
+            <w:tcW w:type="dxa" w:w="2160"/>
+          </w:tcPr>
+          <w:p>
+            <w:r>
+              <w:t>1 (Must)</w:t>
+            </w:r>
+          </w:p>
+        </w:tc>
+        <w:tc>
+          <w:tcPr>
+            <w:tcW w:type="dxa" w:w="2160"/>
+          </w:tcPr>
+          <w:p>
+            <w:r>
+              <w:t>BR-010</w:t>
+            </w:r>
+          </w:p>
+        </w:tc>
+      </w:tr>
+      <w:tr>
+        <w:tc>
+          <w:tcPr>
+            <w:tcW w:type="dxa" w:w="2160"/>
+          </w:tcPr>
+          <w:p>
+            <w:r>
+              <w:t>F16</w:t>
+            </w:r>
+          </w:p>
+        </w:tc>
+        <w:tc>
+          <w:tcPr>
+            <w:tcW w:type="dxa" w:w="2160"/>
+          </w:tcPr>
+          <w:p>
+            <w:r>
+              <w:t>The system shall allow a Customer to download their account statement as a file.</w:t>
+            </w:r>
+          </w:p>
+        </w:tc>
+        <w:tc>
+          <w:tcPr>
+            <w:tcW w:type="dxa" w:w="2160"/>
+          </w:tcPr>
+          <w:p>
+            <w:r>
+              <w:t>2 (Should)</w:t>
+            </w:r>
+          </w:p>
+        </w:tc>
+        <w:tc>
+          <w:tcPr>
+            <w:tcW w:type="dxa" w:w="2160"/>
+          </w:tcPr>
+          <w:p>
+            <w:r>
+              <w:t>BR-011</w:t>
+            </w:r>
+          </w:p>
+        </w:tc>
+      </w:tr>
+      <w:tr>
+        <w:tc>
+          <w:tcPr>
+            <w:tcW w:type="dxa" w:w="2160"/>
+          </w:tcPr>
+          <w:p>
+            <w:r>
+              <w:t>F17</w:t>
+            </w:r>
+          </w:p>
+        </w:tc>
+        <w:tc>
+          <w:tcPr>
+            <w:tcW w:type="dxa" w:w="2160"/>
+          </w:tcPr>
+          <w:p>
+            <w:r>
+              <w:t>The system shall provide Bank operations with an audit-trail view of account and transaction state changes.</w:t>
+            </w:r>
+          </w:p>
+        </w:tc>
+        <w:tc>
+          <w:tcPr>
+            <w:tcW w:type="dxa" w:w="2160"/>
+          </w:tcPr>
+          <w:p>
+            <w:r>
+              <w:t>1 (Must)</w:t>
+            </w:r>
+          </w:p>
+        </w:tc>
+        <w:tc>
+          <w:tcPr>
+            <w:tcW w:type="dxa" w:w="2160"/>
+          </w:tcPr>
+          <w:p>
+            <w:r>
+              <w:t>BR-014</w:t>
             </w:r>
           </w:p>
         </w:tc>
@@ -2216,7 +3533,7 @@
           </w:tcPr>
           <w:p>
             <w:r>
-              <w:t>All agent-produced and system-produced artifacts (requirements, code, tests, defect records) shall be reviewable, reproducible, schema-valid, and source-linked.</w:t>
+              <w:t>KYC and account data shall be protected with baseline security controls (e.g., encryption in transit, access control by role).</w:t>
             </w:r>
           </w:p>
         </w:tc>
@@ -2226,7 +3543,7 @@
           </w:tcPr>
           <w:p>
             <w:r>
-              <w:t>1</w:t>
+              <w:t>1 (Must)</w:t>
             </w:r>
           </w:p>
         </w:tc>
@@ -2236,7 +3553,7 @@
           </w:tcPr>
           <w:p>
             <w:r>
-              <w:t>CH-OBJ-4</w:t>
+              <w:t>BR-020</w:t>
             </w:r>
           </w:p>
         </w:tc>
@@ -2258,7 +3575,7 @@
           </w:tcPr>
           <w:p>
             <w:r>
-              <w:t>The system shall enforce role-based access control distinguishing Customer and Bank operations personas.</w:t>
+              <w:t>Customer PII (Aadhaar, PAN) shall be masked in UI displays and logs outside of authorized KYC review contexts.</w:t>
             </w:r>
           </w:p>
         </w:tc>
@@ -2268,7 +3585,7 @@
           </w:tcPr>
           <w:p>
             <w:r>
-              <w:t>1</w:t>
+              <w:t>2 (Should)</w:t>
             </w:r>
           </w:p>
         </w:tc>
@@ -2278,7 +3595,7 @@
           </w:tcPr>
           <w:p>
             <w:r>
-              <w:t>CH-OBJ-2, SA-ROLE-CUST, SA-ROLE-OPS</w:t>
+              <w:t>BR-020, BR-002</w:t>
             </w:r>
           </w:p>
         </w:tc>
@@ -2300,7 +3617,7 @@
           </w:tcPr>
           <w:p>
             <w:r>
-              <w:t>The system shall maintain an auditable record of state changes to accounts and transactions.</w:t>
+              <w:t>Customer-facing screens shall meet baseline accessibility conformance (e.g., keyboard-navigable, labeled form fields).</w:t>
             </w:r>
           </w:p>
         </w:tc>
@@ -2310,7 +3627,7 @@
           </w:tcPr>
           <w:p>
             <w:r>
-              <w:t>1</w:t>
+              <w:t>2 (Should)</w:t>
             </w:r>
           </w:p>
         </w:tc>
@@ -2320,7 +3637,7 @@
           </w:tcPr>
           <w:p>
             <w:r>
-              <w:t>CH-OBJ-2, BR-007</w:t>
+              <w:t>BR-020</w:t>
             </w:r>
           </w:p>
         </w:tc>
@@ -2342,7 +3659,7 @@
           </w:tcPr>
           <w:p>
             <w:r>
-              <w:t>The system shall meet baseline security and privacy acceptance conditions for handling synthetic KYC and financial data.</w:t>
+              <w:t>Every state-changing action (KYC decision, account activation/freeze, transfer) shall be logged with actor, timestamp, and before/after state to support the audit trail.</w:t>
             </w:r>
           </w:p>
         </w:tc>
@@ -2352,7 +3669,7 @@
           </w:tcPr>
           <w:p>
             <w:r>
-              <w:t>1</w:t>
+              <w:t>1 (Must)</w:t>
             </w:r>
           </w:p>
         </w:tc>
@@ -2362,7 +3679,7 @@
           </w:tcPr>
           <w:p>
             <w:r>
-              <w:t>CH-OBJ-5</w:t>
+              <w:t>BR-014, BR-018</w:t>
             </w:r>
           </w:p>
         </w:tc>
@@ -2384,7 +3701,7 @@
           </w:tcPr>
           <w:p>
             <w:r>
-              <w:t>The system shall meet baseline accessibility acceptance conditions for customer-facing journeys.</w:t>
+              <w:t>Agent-generated pipeline artifacts (BRD, business rules, requirements) shall be schema-valid and source-linked to enable automated traceability checks.</w:t>
             </w:r>
           </w:p>
         </w:tc>
@@ -2394,7 +3711,7 @@
           </w:tcPr>
           <w:p>
             <w:r>
-              <w:t>2</w:t>
+              <w:t>1 (Must)</w:t>
             </w:r>
           </w:p>
         </w:tc>
@@ -2404,7 +3721,7 @@
           </w:tcPr>
           <w:p>
             <w:r>
-              <w:t>CH-OBJ-5</w:t>
+              <w:t>BR-019</w:t>
             </w:r>
           </w:p>
         </w:tc>
@@ -2426,7 +3743,7 @@
           </w:tcPr>
           <w:p>
             <w:r>
-              <w:t>The system shall be designed for testability, enabling automated system-test and defect root-cause-analysis workflows.</w:t>
+              <w:t>Each in-scope customer journey (onboarding, login, transfer, statement) shall be reliable and testable such that it can be exercised end-to-end via automation.</w:t>
             </w:r>
           </w:p>
         </w:tc>
@@ -2436,7 +3753,7 @@
           </w:tcPr>
           <w:p>
             <w:r>
-              <w:t>1</w:t>
+              <w:t>1 (Must)</w:t>
             </w:r>
           </w:p>
         </w:tc>
@@ -2446,91 +3763,7 @@
           </w:tcPr>
           <w:p>
             <w:r>
-              <w:t>CH-OBJ-5, CH-OBJ-3</w:t>
-            </w:r>
-          </w:p>
-        </w:tc>
-      </w:tr>
-      <w:tr>
-        <w:tc>
-          <w:tcPr>
-            <w:tcW w:type="dxa" w:w="2160"/>
-          </w:tcPr>
-          <w:p>
-            <w:r>
-              <w:t>NF7</w:t>
-            </w:r>
-          </w:p>
-        </w:tc>
-        <w:tc>
-          <w:tcPr>
-            <w:tcW w:type="dxa" w:w="2160"/>
-          </w:tcPr>
-          <w:p>
-            <w:r>
-              <w:t>The system shall support a level of reliability appropriate to a simulated banking workload.</w:t>
-            </w:r>
-          </w:p>
-        </w:tc>
-        <w:tc>
-          <w:tcPr>
-            <w:tcW w:type="dxa" w:w="2160"/>
-          </w:tcPr>
-          <w:p>
-            <w:r>
-              <w:t>2</w:t>
-            </w:r>
-          </w:p>
-        </w:tc>
-        <w:tc>
-          <w:tcPr>
-            <w:tcW w:type="dxa" w:w="2160"/>
-          </w:tcPr>
-          <w:p>
-            <w:r>
-              <w:t>CH-OBJ-5</w:t>
-            </w:r>
-          </w:p>
-        </w:tc>
-      </w:tr>
-      <w:tr>
-        <w:tc>
-          <w:tcPr>
-            <w:tcW w:type="dxa" w:w="2160"/>
-          </w:tcPr>
-          <w:p>
-            <w:r>
-              <w:t>NF8</w:t>
-            </w:r>
-          </w:p>
-        </w:tc>
-        <w:tc>
-          <w:tcPr>
-            <w:tcW w:type="dxa" w:w="2160"/>
-          </w:tcPr>
-          <w:p>
-            <w:r>
-              <w:t>Changes to requirements and business rules shall follow versioning and change-control governance.</w:t>
-            </w:r>
-          </w:p>
-        </w:tc>
-        <w:tc>
-          <w:tcPr>
-            <w:tcW w:type="dxa" w:w="2160"/>
-          </w:tcPr>
-          <w:p>
-            <w:r>
-              <w:t>2</w:t>
-            </w:r>
-          </w:p>
-        </w:tc>
-        <w:tc>
-          <w:tcPr>
-            <w:tcW w:type="dxa" w:w="2160"/>
-          </w:tcPr>
-          <w:p>
-            <w:r>
-              <w:t>CH-OBJ-6</w:t>
+              <w:t>BR-020</w:t>
             </w:r>
           </w:p>
         </w:tc>
@@ -2545,8 +3778,35 @@
       </w:r>
     </w:p>
     <w:p>
+      <w:pPr>
+        <w:pStyle w:val="ListBullet"/>
+      </w:pPr>
       <w:r>
-        <w:t>Downstream stages must preserve traceability from each business rule and requirement through design, code, unit tests, system tests, and defect records. Agent-produced artifacts at every stage must remain schema-valid, source-linked, and reviewable, and must be submitted for human approval before being treated as approved (per Objective 4).</w:t>
+        <w:t>Downstream agents must treat every functional and non-functional requirement in this document as tracing to a Business Rule (Section 6), which in turn traces to a scope_agreement.md or charter.md item.</w:t>
+      </w:r>
+    </w:p>
+    <w:p>
+      <w:pPr>
+        <w:pStyle w:val="ListBullet"/>
+      </w:pPr>
+      <w:r>
+        <w:t>Requirements dependent on unresolved open questions (OQ-002 minimum balance, OQ-003 daily cap) must not implement a default numeric limit; implementation must remain configurable/deferred until those questions are answered.</w:t>
+      </w:r>
+    </w:p>
+    <w:p>
+      <w:pPr>
+        <w:pStyle w:val="ListBullet"/>
+      </w:pPr>
+      <w:r>
+        <w:t>Exclusion-type business rules (BR-003, BR-008, BR-015, BR-016, BR-017) must not generate downstream functional requirements or FRD entries; they exist to record intentional scope boundaries so traceability checks can distinguish them from coverage gaps.</w:t>
+      </w:r>
+    </w:p>
+    <w:p>
+      <w:pPr>
+        <w:pStyle w:val="ListBullet"/>
+      </w:pPr>
+      <w:r>
+        <w:t>All artifacts in this pipeline stage (brd.json, business_rules.json, open_questions.json, BRD.md, BRD.docx) are DRAFT and require human review/approval before being treated as an approved baseline for the next stage.</w:t>
       </w:r>
     </w:p>
     <w:p>
@@ -2559,31 +3819,7 @@
     </w:p>
     <w:p>
       <w:r>
-        <w:t>See Section 10 for the open questions carried forward from scope_agreement.md; none of them are yet answered. Resolution is required before the corresponding requirements (noted below) can be finalized:</w:t>
-      </w:r>
-    </w:p>
-    <w:p>
-      <w:pPr>
-        <w:pStyle w:val="ListBullet"/>
-      </w:pPr>
-      <w:r>
-        <w:t>OQ-002 and OQ-003 affect the precise transfer behavior underlying F7.</w:t>
-      </w:r>
-    </w:p>
-    <w:p>
-      <w:pPr>
-        <w:pStyle w:val="ListBullet"/>
-      </w:pPr>
-      <w:r>
-        <w:t>OQ-004 affects the test-automation approach underlying NF6.</w:t>
-      </w:r>
-    </w:p>
-    <w:p>
-      <w:pPr>
-        <w:pStyle w:val="ListBullet"/>
-      </w:pPr>
-      <w:r>
-        <w:t>OQ-001 affects the handover and acceptance process (Section 10).</w:t>
+        <w:t>No implementation issues have been raised at this stage; this document precedes design and build. Open questions that may surface issues if unresolved before downstream work begins are tracked in Section 10 and in open_questions.json.</w:t>
       </w:r>
     </w:p>
     <w:p>
@@ -2592,6 +3828,11 @@
       </w:pPr>
       <w:r>
         <w:t>10. Handover</w:t>
+      </w:r>
+    </w:p>
+    <w:p>
+      <w:r>
+        <w:t>This BRD, together with business_rules.json, open_questions.json, and this document's rendered BRD.docx, is the handover package from the BRD agent (Stage 1) to the technical design/coding/unit-testing agent (Stage 2) of the Group 2 pipeline. All open questions below must be tracked to resolution; none are assumed answered in this draft.</w:t>
       </w:r>
     </w:p>
     <w:tbl>
@@ -2687,7 +3928,7 @@
           </w:tcPr>
           <w:p>
             <w:r>
-              <w:t>Unassigned</w:t>
+              <w:t>Business stakeholders (TBD)</w:t>
             </w:r>
           </w:p>
         </w:tc>
@@ -2697,7 +3938,7 @@
           </w:tcPr>
           <w:p>
             <w:r>
-              <w:t>Handover; acceptance of Customer and Bank operations journeys</w:t>
+              <w:t>UAT sign-off for all in-scope journeys; BRD approval to Ready status</w:t>
             </w:r>
           </w:p>
         </w:tc>
@@ -2729,7 +3970,7 @@
           </w:tcPr>
           <w:p>
             <w:r>
-              <w:t>Unassigned</w:t>
+              <w:t>Business stakeholders (TBD)</w:t>
             </w:r>
           </w:p>
         </w:tc>
@@ -2739,7 +3980,7 @@
           </w:tcPr>
           <w:p>
             <w:r>
-              <w:t>F7, F8, BR-005</w:t>
+              <w:t>F11 - initiate money transfer; F13 - debit/credit balance on transfer</w:t>
             </w:r>
           </w:p>
         </w:tc>
@@ -2771,7 +4012,7 @@
           </w:tcPr>
           <w:p>
             <w:r>
-              <w:t>Unassigned</w:t>
+              <w:t>Business stakeholders (TBD)</w:t>
             </w:r>
           </w:p>
         </w:tc>
@@ -2781,7 +4022,7 @@
           </w:tcPr>
           <w:p>
             <w:r>
-              <w:t>F7, BR-005</w:t>
+              <w:t>F11 - initiate money transfer; F13 - debit/credit balance on transfer</w:t>
             </w:r>
           </w:p>
         </w:tc>
@@ -2813,7 +4054,7 @@
           </w:tcPr>
           <w:p>
             <w:r>
-              <w:t>Unassigned</w:t>
+              <w:t>Quality Assurance &amp; Testing (Mandeep &amp; Team)</w:t>
             </w:r>
           </w:p>
         </w:tc>
@@ -2823,17 +4064,12 @@
           </w:tcPr>
           <w:p>
             <w:r>
-              <w:t>NF6</w:t>
+              <w:t>System-test/automation agent test authoring</w:t>
             </w:r>
           </w:p>
         </w:tc>
       </w:tr>
     </w:tbl>
-    <w:p>
-      <w:r>
-        <w:t>This BRD is DRAFT and requires human approval before handover to the design/build stage. All open questions above must be resolved or explicitly deferred by the approving stakeholder before downstream agents treat this document as a baseline.</w:t>
-      </w:r>
-    </w:p>
     <w:sectPr>
       <w:pgSz w:w="12240" w:h="15840"/>
       <w:pgMar w:top="1440" w:right="1800" w:bottom="1440" w:left="1800" w:header="720" w:footer="720" w:gutter="0"/>

</xml_diff>